<commit_message>
feat: add review validation, delete endpoint and improve relationships
</commit_message>
<xml_diff>
--- a/Report.docx
+++ b/Report.docx
@@ -10,39 +10,29 @@
           <w:lang w:val="en-GB"/>
         </w:rPr>
       </w:pPr>
-      <w:proofErr w:type="spellStart"/>
       <w:r>
         <w:rPr>
           <w:b/>
           <w:bCs/>
           <w:lang w:val="en-GB"/>
         </w:rPr>
-        <w:t>Fullstack</w:t>
-      </w:r>
-      <w:proofErr w:type="spellEnd"/>
-      <w:r>
+        <w:t>Fullstack Movie App Report</w:t>
+      </w:r>
+    </w:p>
+    <w:p>
+      <w:pPr>
         <w:rPr>
           <w:b/>
           <w:bCs/>
           <w:lang w:val="en-GB"/>
         </w:rPr>
-        <w:t xml:space="preserve"> Movie App Report</w:t>
-      </w:r>
-    </w:p>
-    <w:p>
-      <w:pPr>
+      </w:pPr>
+      <w:r>
         <w:rPr>
           <w:b/>
           <w:bCs/>
           <w:lang w:val="en-GB"/>
         </w:rPr>
-      </w:pPr>
-      <w:r>
-        <w:rPr>
-          <w:b/>
-          <w:bCs/>
-          <w:lang w:val="en-GB"/>
-        </w:rPr>
         <w:t>1. System Overview</w:t>
       </w:r>
     </w:p>
@@ -81,8 +71,8 @@
     </w:p>
     <w:p>
       <w:r>
-        <w:pict w14:anchorId="54613945">
-          <v:rect id="_x0000_i1025" style="width:0;height:1.5pt" o:hralign="center" o:hrstd="t" o:hr="t" fillcolor="#a0a0a0" stroked="f"/>
+        <w:pict w14:anchorId="53F7EE8F">
+          <v:rect id="_x0000_i1037" style="width:0;height:1.5pt" o:hralign="center" o:hrstd="t" o:hr="t" fillcolor="#a0a0a0" stroked="f"/>
         </w:pict>
       </w:r>
     </w:p>
@@ -134,11 +124,9 @@
           <w:numId w:val="1"/>
         </w:numPr>
       </w:pPr>
-      <w:proofErr w:type="spellStart"/>
       <w:r>
         <w:t>Users</w:t>
       </w:r>
-      <w:proofErr w:type="spellEnd"/>
     </w:p>
     <w:p>
       <w:pPr>
@@ -176,11 +164,9 @@
           <w:numId w:val="2"/>
         </w:numPr>
       </w:pPr>
-      <w:proofErr w:type="spellStart"/>
       <w:r>
         <w:t>title</w:t>
       </w:r>
-      <w:proofErr w:type="spellEnd"/>
     </w:p>
     <w:p>
       <w:pPr>
@@ -200,11 +186,9 @@
           <w:numId w:val="2"/>
         </w:numPr>
       </w:pPr>
-      <w:proofErr w:type="spellStart"/>
       <w:r>
         <w:t>releaseYear</w:t>
       </w:r>
-      <w:proofErr w:type="spellEnd"/>
     </w:p>
     <w:p>
       <w:pPr>
@@ -213,20 +197,13 @@
           <w:numId w:val="2"/>
         </w:numPr>
       </w:pPr>
-      <w:proofErr w:type="spellStart"/>
       <w:r>
         <w:t>averageRating</w:t>
       </w:r>
-      <w:proofErr w:type="spellEnd"/>
-    </w:p>
-    <w:p>
-      <w:proofErr w:type="spellStart"/>
-      <w:r>
-        <w:t>Users</w:t>
-      </w:r>
-      <w:proofErr w:type="spellEnd"/>
-      <w:r>
-        <w:t>:</w:t>
+    </w:p>
+    <w:p>
+      <w:r>
+        <w:t>Users:</w:t>
       </w:r>
     </w:p>
     <w:p>
@@ -236,11 +213,9 @@
           <w:numId w:val="3"/>
         </w:numPr>
       </w:pPr>
-      <w:proofErr w:type="spellStart"/>
       <w:r>
         <w:t>name</w:t>
       </w:r>
-      <w:proofErr w:type="spellEnd"/>
     </w:p>
     <w:p>
       <w:pPr>
@@ -265,21 +240,8 @@
           <w:numId w:val="4"/>
         </w:numPr>
       </w:pPr>
-      <w:proofErr w:type="spellStart"/>
-      <w:r>
-        <w:t>movieId</w:t>
-      </w:r>
-      <w:proofErr w:type="spellEnd"/>
-      <w:r>
-        <w:t xml:space="preserve"> (</w:t>
-      </w:r>
-      <w:proofErr w:type="spellStart"/>
-      <w:r>
-        <w:t>reference</w:t>
-      </w:r>
-      <w:proofErr w:type="spellEnd"/>
-      <w:r>
-        <w:t xml:space="preserve"> to Movie)</w:t>
+      <w:r>
+        <w:t>movieId (reference to Movie)</w:t>
       </w:r>
     </w:p>
     <w:p>
@@ -289,29 +251,8 @@
           <w:numId w:val="4"/>
         </w:numPr>
       </w:pPr>
-      <w:proofErr w:type="spellStart"/>
-      <w:r>
-        <w:t>userId</w:t>
-      </w:r>
-      <w:proofErr w:type="spellEnd"/>
-      <w:r>
-        <w:t xml:space="preserve"> (</w:t>
-      </w:r>
-      <w:proofErr w:type="spellStart"/>
-      <w:r>
-        <w:t>reference</w:t>
-      </w:r>
-      <w:proofErr w:type="spellEnd"/>
-      <w:r>
-        <w:t xml:space="preserve"> to </w:t>
-      </w:r>
-      <w:proofErr w:type="spellStart"/>
-      <w:r>
-        <w:t>User</w:t>
-      </w:r>
-      <w:proofErr w:type="spellEnd"/>
-      <w:r>
-        <w:t>)</w:t>
+      <w:r>
+        <w:t>userId (reference to User)</w:t>
       </w:r>
     </w:p>
     <w:p>
@@ -321,11 +262,9 @@
           <w:numId w:val="4"/>
         </w:numPr>
       </w:pPr>
-      <w:proofErr w:type="spellStart"/>
       <w:r>
         <w:t>comment</w:t>
       </w:r>
-      <w:proofErr w:type="spellEnd"/>
     </w:p>
     <w:p>
       <w:pPr>
@@ -357,21 +296,7 @@
         <w:rPr>
           <w:lang w:val="en-GB"/>
         </w:rPr>
-        <w:t xml:space="preserve">A review is connected to a movie and a user using </w:t>
-      </w:r>
-      <w:proofErr w:type="spellStart"/>
-      <w:r>
-        <w:rPr>
-          <w:lang w:val="en-GB"/>
-        </w:rPr>
-        <w:t>ObjectId</w:t>
-      </w:r>
-      <w:proofErr w:type="spellEnd"/>
-      <w:r>
-        <w:rPr>
-          <w:lang w:val="en-GB"/>
-        </w:rPr>
-        <w:t>.</w:t>
+        <w:t>A review is connected to a movie and a user using ObjectId.</w:t>
       </w:r>
     </w:p>
     <w:p>
@@ -407,8 +332,8 @@
     </w:p>
     <w:p>
       <w:r>
-        <w:pict w14:anchorId="30DEEBE7">
-          <v:rect id="_x0000_i1026" style="width:0;height:1.5pt" o:hralign="center" o:hrstd="t" o:hr="t" fillcolor="#a0a0a0" stroked="f"/>
+        <w:pict w14:anchorId="6987BBEA">
+          <v:rect id="_x0000_i1038" style="width:0;height:1.5pt" o:hralign="center" o:hrstd="t" o:hr="t" fillcolor="#a0a0a0" stroked="f"/>
         </w:pict>
       </w:r>
     </w:p>
@@ -456,21 +381,7 @@
         <w:rPr>
           <w:lang w:val="en-GB"/>
         </w:rPr>
-        <w:t>GET /</w:t>
-      </w:r>
-      <w:proofErr w:type="spellStart"/>
-      <w:r>
-        <w:rPr>
-          <w:lang w:val="en-GB"/>
-        </w:rPr>
-        <w:t>api</w:t>
-      </w:r>
-      <w:proofErr w:type="spellEnd"/>
-      <w:r>
-        <w:rPr>
-          <w:lang w:val="en-GB"/>
-        </w:rPr>
-        <w:t>/movies</w:t>
+        <w:t>GET /api/movies</w:t>
       </w:r>
     </w:p>
     <w:p>
@@ -550,8 +461,8 @@
     </w:p>
     <w:p>
       <w:r>
-        <w:pict w14:anchorId="730CBC9B">
-          <v:rect id="_x0000_i1027" style="width:0;height:1.5pt" o:hralign="center" o:hrstd="t" o:hr="t" fillcolor="#a0a0a0" stroked="f"/>
+        <w:pict w14:anchorId="1740E34A">
+          <v:rect id="_x0000_i1039" style="width:0;height:1.5pt" o:hralign="center" o:hrstd="t" o:hr="t" fillcolor="#a0a0a0" stroked="f"/>
         </w:pict>
       </w:r>
     </w:p>
@@ -582,21 +493,7 @@
         <w:rPr>
           <w:lang w:val="en-GB"/>
         </w:rPr>
-        <w:t>DELETE /</w:t>
-      </w:r>
-      <w:proofErr w:type="spellStart"/>
-      <w:r>
-        <w:rPr>
-          <w:lang w:val="en-GB"/>
-        </w:rPr>
-        <w:t>api</w:t>
-      </w:r>
-      <w:proofErr w:type="spellEnd"/>
-      <w:r>
-        <w:rPr>
-          <w:lang w:val="en-GB"/>
-        </w:rPr>
-        <w:t>/movies/:id</w:t>
+        <w:t>DELETE /api/movies/:id</w:t>
       </w:r>
     </w:p>
     <w:p>
@@ -648,8 +545,8 @@
     </w:p>
     <w:p>
       <w:r>
-        <w:pict w14:anchorId="4AAC6F48">
-          <v:rect id="_x0000_i1028" style="width:0;height:1.5pt" o:hralign="center" o:hrstd="t" o:hr="t" fillcolor="#a0a0a0" stroked="f"/>
+        <w:pict w14:anchorId="2F5C5B36">
+          <v:rect id="_x0000_i1040" style="width:0;height:1.5pt" o:hralign="center" o:hrstd="t" o:hr="t" fillcolor="#a0a0a0" stroked="f"/>
         </w:pict>
       </w:r>
     </w:p>
@@ -720,64 +617,14 @@
         <w:rPr>
           <w:lang w:val="en-GB"/>
         </w:rPr>
-        <w:t xml:space="preserve">I also had a problem with Git where I accidentally committed </w:t>
-      </w:r>
-      <w:proofErr w:type="spellStart"/>
-      <w:r>
-        <w:rPr>
-          <w:lang w:val="en-GB"/>
-        </w:rPr>
-        <w:t>node_modules</w:t>
-      </w:r>
-      <w:proofErr w:type="spellEnd"/>
-      <w:r>
-        <w:rPr>
-          <w:lang w:val="en-GB"/>
-        </w:rPr>
-        <w:t>, which made the project very large.</w:t>
+        <w:t>I also had a problem with Git where I accidentally committed node_modules, which made the project very large.</w:t>
       </w:r>
       <w:r>
         <w:rPr>
           <w:lang w:val="en-GB"/>
         </w:rPr>
         <w:br/>
-        <w:t xml:space="preserve">I fixed it by using </w:t>
-      </w:r>
-      <w:proofErr w:type="gramStart"/>
-      <w:r>
-        <w:rPr>
-          <w:lang w:val="en-GB"/>
-        </w:rPr>
-        <w:t>a .</w:t>
-      </w:r>
-      <w:proofErr w:type="spellStart"/>
-      <w:r>
-        <w:rPr>
-          <w:lang w:val="en-GB"/>
-        </w:rPr>
-        <w:t>gitignore</w:t>
-      </w:r>
-      <w:proofErr w:type="spellEnd"/>
-      <w:proofErr w:type="gramEnd"/>
-      <w:r>
-        <w:rPr>
-          <w:lang w:val="en-GB"/>
-        </w:rPr>
-        <w:t xml:space="preserve"> file and removing </w:t>
-      </w:r>
-      <w:proofErr w:type="spellStart"/>
-      <w:r>
-        <w:rPr>
-          <w:lang w:val="en-GB"/>
-        </w:rPr>
-        <w:t>node_modules</w:t>
-      </w:r>
-      <w:proofErr w:type="spellEnd"/>
-      <w:r>
-        <w:rPr>
-          <w:lang w:val="en-GB"/>
-        </w:rPr>
-        <w:t xml:space="preserve"> from Git.</w:t>
+        <w:t>I fixed it by using a .gitignore file and removing node_modules from Git.</w:t>
       </w:r>
     </w:p>
     <w:p>
@@ -796,8 +643,8 @@
     </w:p>
     <w:p>
       <w:r>
-        <w:pict w14:anchorId="5436096D">
-          <v:rect id="_x0000_i1029" style="width:0;height:1.5pt" o:hralign="center" o:hrstd="t" o:hr="t" fillcolor="#a0a0a0" stroked="f"/>
+        <w:pict w14:anchorId="0523EB7B">
+          <v:rect id="_x0000_i1041" style="width:0;height:1.5pt" o:hralign="center" o:hrstd="t" o:hr="t" fillcolor="#a0a0a0" stroked="f"/>
         </w:pict>
       </w:r>
     </w:p>
@@ -861,20 +708,7 @@
           <w:lang w:val="en-GB"/>
         </w:rPr>
         <w:br/>
-      </w:r>
-      <w:proofErr w:type="spellStart"/>
-      <w:r>
-        <w:rPr>
-          <w:lang w:val="en-GB"/>
-        </w:rPr>
-        <w:t>npm</w:t>
-      </w:r>
-      <w:proofErr w:type="spellEnd"/>
-      <w:r>
-        <w:rPr>
-          <w:lang w:val="en-GB"/>
-        </w:rPr>
-        <w:t xml:space="preserve"> run dev</w:t>
+        <w:t>npm run dev</w:t>
       </w:r>
     </w:p>
     <w:p>
@@ -896,19 +730,11 @@
           <w:lang w:val="en-GB"/>
         </w:rPr>
       </w:pPr>
-      <w:proofErr w:type="spellStart"/>
-      <w:r>
-        <w:rPr>
-          <w:lang w:val="en-GB"/>
-        </w:rPr>
-        <w:t>npm</w:t>
-      </w:r>
-      <w:proofErr w:type="spellEnd"/>
-      <w:r>
-        <w:rPr>
-          <w:lang w:val="en-GB"/>
-        </w:rPr>
-        <w:t xml:space="preserve"> run dev</w:t>
+      <w:r>
+        <w:rPr>
+          <w:lang w:val="en-GB"/>
+        </w:rPr>
+        <w:t>npm run dev</w:t>
       </w:r>
     </w:p>
     <w:p>
@@ -939,8 +765,8 @@
     </w:p>
     <w:p>
       <w:r>
-        <w:pict w14:anchorId="3814867F">
-          <v:rect id="_x0000_i1030" style="width:0;height:1.5pt" o:hralign="center" o:hrstd="t" o:hr="t" fillcolor="#a0a0a0" stroked="f"/>
+        <w:pict w14:anchorId="4E0D7E63">
+          <v:rect id="_x0000_i1042" style="width:0;height:1.5pt" o:hralign="center" o:hrstd="t" o:hr="t" fillcolor="#a0a0a0" stroked="f"/>
         </w:pict>
       </w:r>
     </w:p>
@@ -971,35 +797,7 @@
         <w:rPr>
           <w:lang w:val="en-GB"/>
         </w:rPr>
-        <w:t xml:space="preserve">This project helped me understand </w:t>
-      </w:r>
-      <w:proofErr w:type="spellStart"/>
-      <w:r>
-        <w:rPr>
-          <w:lang w:val="en-GB"/>
-        </w:rPr>
-        <w:t>fullstack</w:t>
-      </w:r>
-      <w:proofErr w:type="spellEnd"/>
-      <w:r>
-        <w:rPr>
-          <w:lang w:val="en-GB"/>
-        </w:rPr>
-        <w:t xml:space="preserve"> development better, especially how different parts of the system </w:t>
-      </w:r>
-      <w:proofErr w:type="gramStart"/>
-      <w:r>
-        <w:rPr>
-          <w:lang w:val="en-GB"/>
-        </w:rPr>
-        <w:t>connect together</w:t>
-      </w:r>
-      <w:proofErr w:type="gramEnd"/>
-      <w:r>
-        <w:rPr>
-          <w:lang w:val="en-GB"/>
-        </w:rPr>
-        <w:t>.</w:t>
+        <w:t>This project helped me understand fullstack development better, especially how different parts of the system connect together.</w:t>
       </w:r>
       <w:r>
         <w:rPr>
@@ -1263,26 +1061,16 @@
                               <w:jc w:val="center"/>
                             </w:pPr>
                             <w:r>
-                              <w:t xml:space="preserve">- </w:t>
+                              <w:t>- movieId</w:t>
                             </w:r>
-                            <w:proofErr w:type="spellStart"/>
-                            <w:r>
-                              <w:t>movieId</w:t>
-                            </w:r>
-                            <w:proofErr w:type="spellEnd"/>
                           </w:p>
                           <w:p>
                             <w:pPr>
                               <w:jc w:val="center"/>
                             </w:pPr>
                             <w:r>
-                              <w:t xml:space="preserve">- </w:t>
+                              <w:t>- userId</w:t>
                             </w:r>
-                            <w:proofErr w:type="spellStart"/>
-                            <w:r>
-                              <w:t>userId</w:t>
-                            </w:r>
-                            <w:proofErr w:type="spellEnd"/>
                           </w:p>
                           <w:p>
                             <w:pPr>
@@ -1297,13 +1085,8 @@
                               <w:jc w:val="center"/>
                             </w:pPr>
                             <w:r>
-                              <w:t xml:space="preserve">- </w:t>
+                              <w:t>- comment</w:t>
                             </w:r>
-                            <w:proofErr w:type="spellStart"/>
-                            <w:r>
-                              <w:t>comment</w:t>
-                            </w:r>
-                            <w:proofErr w:type="spellEnd"/>
                           </w:p>
                         </w:txbxContent>
                       </wps:txbx>
@@ -1340,26 +1123,16 @@
                         <w:jc w:val="center"/>
                       </w:pPr>
                       <w:r>
-                        <w:t xml:space="preserve">- </w:t>
+                        <w:t>- movieId</w:t>
                       </w:r>
-                      <w:proofErr w:type="spellStart"/>
-                      <w:r>
-                        <w:t>movieId</w:t>
-                      </w:r>
-                      <w:proofErr w:type="spellEnd"/>
                     </w:p>
                     <w:p>
                       <w:pPr>
                         <w:jc w:val="center"/>
                       </w:pPr>
                       <w:r>
-                        <w:t xml:space="preserve">- </w:t>
+                        <w:t>- userId</w:t>
                       </w:r>
-                      <w:proofErr w:type="spellStart"/>
-                      <w:r>
-                        <w:t>userId</w:t>
-                      </w:r>
-                      <w:proofErr w:type="spellEnd"/>
                     </w:p>
                     <w:p>
                       <w:pPr>
@@ -1374,13 +1147,8 @@
                         <w:jc w:val="center"/>
                       </w:pPr>
                       <w:r>
-                        <w:t xml:space="preserve">- </w:t>
+                        <w:t>- comment</w:t>
                       </w:r>
-                      <w:proofErr w:type="spellStart"/>
-                      <w:r>
-                        <w:t>comment</w:t>
-                      </w:r>
-                      <w:proofErr w:type="spellEnd"/>
                     </w:p>
                   </w:txbxContent>
                 </v:textbox>
@@ -1454,13 +1222,8 @@
                               <w:jc w:val="center"/>
                             </w:pPr>
                             <w:r>
-                              <w:t xml:space="preserve">- </w:t>
+                              <w:t>- title</w:t>
                             </w:r>
-                            <w:proofErr w:type="spellStart"/>
-                            <w:r>
-                              <w:t>title</w:t>
-                            </w:r>
-                            <w:proofErr w:type="spellEnd"/>
                           </w:p>
                           <w:p>
                             <w:pPr>
@@ -1502,13 +1265,8 @@
                         <w:jc w:val="center"/>
                       </w:pPr>
                       <w:r>
-                        <w:t xml:space="preserve">- </w:t>
+                        <w:t>- title</w:t>
                       </w:r>
-                      <w:proofErr w:type="spellStart"/>
-                      <w:r>
-                        <w:t>title</w:t>
-                      </w:r>
-                      <w:proofErr w:type="spellEnd"/>
                     </w:p>
                     <w:p>
                       <w:pPr>
@@ -1581,24 +1339,17 @@
                             <w:pPr>
                               <w:jc w:val="center"/>
                             </w:pPr>
-                            <w:proofErr w:type="spellStart"/>
                             <w:r>
                               <w:t>User</w:t>
                             </w:r>
-                            <w:proofErr w:type="spellEnd"/>
                           </w:p>
                           <w:p>
                             <w:pPr>
                               <w:jc w:val="center"/>
                             </w:pPr>
                             <w:r>
-                              <w:t xml:space="preserve">- </w:t>
+                              <w:t>- name</w:t>
                             </w:r>
-                            <w:proofErr w:type="spellStart"/>
-                            <w:r>
-                              <w:t>name</w:t>
-                            </w:r>
-                            <w:proofErr w:type="spellEnd"/>
                           </w:p>
                           <w:p>
                             <w:pPr>
@@ -1631,24 +1382,17 @@
                       <w:pPr>
                         <w:jc w:val="center"/>
                       </w:pPr>
-                      <w:proofErr w:type="spellStart"/>
                       <w:r>
                         <w:t>User</w:t>
                       </w:r>
-                      <w:proofErr w:type="spellEnd"/>
                     </w:p>
                     <w:p>
                       <w:pPr>
                         <w:jc w:val="center"/>
                       </w:pPr>
                       <w:r>
-                        <w:t xml:space="preserve">- </w:t>
+                        <w:t>- name</w:t>
                       </w:r>
-                      <w:proofErr w:type="spellStart"/>
-                      <w:r>
-                        <w:t>name</w:t>
-                      </w:r>
-                      <w:proofErr w:type="spellEnd"/>
                     </w:p>
                     <w:p>
                       <w:pPr>
@@ -1678,11 +1422,9 @@
       <w:pPr>
         <w:jc w:val="center"/>
       </w:pPr>
-      <w:proofErr w:type="spellStart"/>
       <w:r>
         <w:t>writes</w:t>
       </w:r>
-      <w:proofErr w:type="spellEnd"/>
     </w:p>
     <w:p>
       <w:pPr>
@@ -1713,7 +1455,6 @@
           <w:tab w:val="left" w:pos="3720"/>
         </w:tabs>
         <w:rPr>
-          <w:rFonts w:hint="cs"/>
           <w:rtl/>
           <w:lang w:val="en-GB"/>
         </w:rPr>
@@ -3180,6 +2921,7 @@
   <w:style w:type="character" w:default="1" w:styleId="DefaultParagraphFont">
     <w:name w:val="Default Paragraph Font"/>
     <w:uiPriority w:val="1"/>
+    <w:semiHidden/>
     <w:unhideWhenUsed/>
   </w:style>
   <w:style w:type="table" w:default="1" w:styleId="TableNormal">

</xml_diff>

<commit_message>
refactor: move review creation to controller and finalize API
</commit_message>
<xml_diff>
--- a/Report.docx
+++ b/Report.docx
@@ -72,7 +72,7 @@
     <w:p>
       <w:r>
         <w:pict w14:anchorId="53F7EE8F">
-          <v:rect id="_x0000_i1037" style="width:0;height:1.5pt" o:hralign="center" o:hrstd="t" o:hr="t" fillcolor="#a0a0a0" stroked="f"/>
+          <v:rect id="_x0000_i1025" style="width:0;height:1.5pt" o:hralign="center" o:hrstd="t" o:hr="t" fillcolor="#a0a0a0" stroked="f"/>
         </w:pict>
       </w:r>
     </w:p>
@@ -333,7 +333,7 @@
     <w:p>
       <w:r>
         <w:pict w14:anchorId="6987BBEA">
-          <v:rect id="_x0000_i1038" style="width:0;height:1.5pt" o:hralign="center" o:hrstd="t" o:hr="t" fillcolor="#a0a0a0" stroked="f"/>
+          <v:rect id="_x0000_i1026" style="width:0;height:1.5pt" o:hralign="center" o:hrstd="t" o:hr="t" fillcolor="#a0a0a0" stroked="f"/>
         </w:pict>
       </w:r>
     </w:p>
@@ -462,7 +462,7 @@
     <w:p>
       <w:r>
         <w:pict w14:anchorId="1740E34A">
-          <v:rect id="_x0000_i1039" style="width:0;height:1.5pt" o:hralign="center" o:hrstd="t" o:hr="t" fillcolor="#a0a0a0" stroked="f"/>
+          <v:rect id="_x0000_i1027" style="width:0;height:1.5pt" o:hralign="center" o:hrstd="t" o:hr="t" fillcolor="#a0a0a0" stroked="f"/>
         </w:pict>
       </w:r>
     </w:p>
@@ -546,7 +546,7 @@
     <w:p>
       <w:r>
         <w:pict w14:anchorId="2F5C5B36">
-          <v:rect id="_x0000_i1040" style="width:0;height:1.5pt" o:hralign="center" o:hrstd="t" o:hr="t" fillcolor="#a0a0a0" stroked="f"/>
+          <v:rect id="_x0000_i1028" style="width:0;height:1.5pt" o:hralign="center" o:hrstd="t" o:hr="t" fillcolor="#a0a0a0" stroked="f"/>
         </w:pict>
       </w:r>
     </w:p>
@@ -570,81 +570,283 @@
     <w:p>
       <w:pPr>
         <w:rPr>
-          <w:lang w:val="en-GB"/>
-        </w:rPr>
-      </w:pPr>
-      <w:r>
-        <w:rPr>
-          <w:lang w:val="en-GB"/>
-        </w:rPr>
-        <w:t>One challenge I faced was connecting the frontend with the backend correctly.</w:t>
-      </w:r>
-      <w:r>
-        <w:rPr>
-          <w:lang w:val="en-GB"/>
-        </w:rPr>
-        <w:br/>
-        <w:t>At the beginning, I had issues with requests not working and errors in the console.</w:t>
-      </w:r>
-    </w:p>
-    <w:p>
-      <w:pPr>
-        <w:rPr>
-          <w:lang w:val="en-GB"/>
-        </w:rPr>
-      </w:pPr>
-      <w:r>
-        <w:rPr>
-          <w:lang w:val="en-GB"/>
-        </w:rPr>
-        <w:t>Another issue was handling empty inputs in the form.</w:t>
-      </w:r>
-      <w:r>
-        <w:rPr>
-          <w:lang w:val="en-GB"/>
-        </w:rPr>
-        <w:br/>
-        <w:t>When I tried to add a movie without filling the fields, it caused problems, so I added validation in the frontend.</w:t>
-      </w:r>
-    </w:p>
-    <w:p>
-      <w:pPr>
-        <w:rPr>
-          <w:lang w:val="en-GB"/>
-        </w:rPr>
-      </w:pPr>
-      <w:r>
-        <w:rPr>
-          <w:lang w:val="en-GB"/>
-        </w:rPr>
-        <w:t>I also had a problem with Git where I accidentally committed node_modules, which made the project very large.</w:t>
-      </w:r>
-      <w:r>
-        <w:rPr>
-          <w:lang w:val="en-GB"/>
-        </w:rPr>
-        <w:br/>
-        <w:t>I fixed it by using a .gitignore file and removing node_modules from Git.</w:t>
-      </w:r>
-    </w:p>
-    <w:p>
-      <w:pPr>
-        <w:rPr>
-          <w:lang w:val="en-GB"/>
-        </w:rPr>
-      </w:pPr>
-      <w:r>
-        <w:rPr>
+          <w:b/>
+          <w:bCs/>
+          <w:lang w:val="en-GB"/>
+        </w:rPr>
+      </w:pPr>
+    </w:p>
+    <w:p>
+      <w:pPr>
+        <w:rPr>
+          <w:b/>
+          <w:bCs/>
+          <w:lang w:val="en-GB"/>
+        </w:rPr>
+      </w:pPr>
+      <w:r>
+        <w:rPr>
+          <w:b/>
+          <w:bCs/>
+          <w:lang w:val="en-GB"/>
+        </w:rPr>
+        <w:t xml:space="preserve">One challenge I faced was connecting the frontend with the backend correctly. </w:t>
+      </w:r>
+    </w:p>
+    <w:p>
+      <w:pPr>
+        <w:rPr>
+          <w:b/>
+          <w:bCs/>
+          <w:lang w:val="en-GB"/>
+        </w:rPr>
+      </w:pPr>
+      <w:r>
+        <w:rPr>
+          <w:b/>
+          <w:bCs/>
+          <w:lang w:val="en-GB"/>
+        </w:rPr>
+        <w:t>At the beginning, I had issues with requests not working and errors appearing in the console.</w:t>
+      </w:r>
+    </w:p>
+    <w:p>
+      <w:pPr>
+        <w:rPr>
+          <w:b/>
+          <w:bCs/>
+          <w:lang w:val="en-GB"/>
+        </w:rPr>
+      </w:pPr>
+    </w:p>
+    <w:p>
+      <w:pPr>
+        <w:rPr>
+          <w:b/>
+          <w:bCs/>
+          <w:lang w:val="en-GB"/>
+        </w:rPr>
+      </w:pPr>
+      <w:r>
+        <w:rPr>
+          <w:b/>
+          <w:bCs/>
+          <w:lang w:val="en-GB"/>
+        </w:rPr>
+        <w:t xml:space="preserve">Another issue was handling empty inputs in the form. </w:t>
+      </w:r>
+    </w:p>
+    <w:p>
+      <w:pPr>
+        <w:rPr>
+          <w:b/>
+          <w:bCs/>
+          <w:lang w:val="en-GB"/>
+        </w:rPr>
+      </w:pPr>
+      <w:r>
+        <w:rPr>
+          <w:b/>
+          <w:bCs/>
           <w:lang w:val="en-GB"/>
         </w:rPr>
         <w:lastRenderedPageBreak/>
-        <w:t>From this project, I learned how React and Express work together, how to use APIs, and how to manage a MongoDB database.</w:t>
-      </w:r>
-    </w:p>
-    <w:p>
+        <w:t>When I tried to add a movie without filling all fields, it caused problems, so I added validation in the frontend.</w:t>
+      </w:r>
+    </w:p>
+    <w:p>
+      <w:pPr>
+        <w:rPr>
+          <w:b/>
+          <w:bCs/>
+          <w:lang w:val="en-GB"/>
+        </w:rPr>
+      </w:pPr>
+    </w:p>
+    <w:p>
+      <w:pPr>
+        <w:rPr>
+          <w:b/>
+          <w:bCs/>
+          <w:lang w:val="en-GB"/>
+        </w:rPr>
+      </w:pPr>
+      <w:r>
+        <w:rPr>
+          <w:b/>
+          <w:bCs/>
+          <w:lang w:val="en-GB"/>
+        </w:rPr>
+        <w:t xml:space="preserve">I also faced a problem with Git where I accidentally committed the node_modules folder, which made the project very large. </w:t>
+      </w:r>
+    </w:p>
+    <w:p>
+      <w:pPr>
+        <w:rPr>
+          <w:b/>
+          <w:bCs/>
+          <w:lang w:val="en-GB"/>
+        </w:rPr>
+      </w:pPr>
+      <w:r>
+        <w:rPr>
+          <w:b/>
+          <w:bCs/>
+          <w:lang w:val="en-GB"/>
+        </w:rPr>
+        <w:t>I fixed this by using a .gitignore file and removing node_modules from the repository.</w:t>
+      </w:r>
+    </w:p>
+    <w:p>
+      <w:pPr>
+        <w:rPr>
+          <w:b/>
+          <w:bCs/>
+          <w:lang w:val="en-GB"/>
+        </w:rPr>
+      </w:pPr>
+    </w:p>
+    <w:p>
+      <w:pPr>
+        <w:rPr>
+          <w:b/>
+          <w:bCs/>
+          <w:lang w:val="en-GB"/>
+        </w:rPr>
+      </w:pPr>
+      <w:r>
+        <w:rPr>
+          <w:b/>
+          <w:bCs/>
+          <w:lang w:val="en-GB"/>
+        </w:rPr>
+        <w:t xml:space="preserve">Another challenge was handling ObjectId validation when creating reviews. </w:t>
+      </w:r>
+    </w:p>
+    <w:p>
+      <w:pPr>
+        <w:rPr>
+          <w:b/>
+          <w:bCs/>
+          <w:lang w:val="en-GB"/>
+        </w:rPr>
+      </w:pPr>
+      <w:r>
+        <w:rPr>
+          <w:b/>
+          <w:bCs/>
+          <w:lang w:val="en-GB"/>
+        </w:rPr>
+        <w:t xml:space="preserve">Initially, I received errors when sending userId and movieId. </w:t>
+      </w:r>
+    </w:p>
+    <w:p>
+      <w:pPr>
+        <w:rPr>
+          <w:b/>
+          <w:bCs/>
+          <w:lang w:val="en-GB"/>
+        </w:rPr>
+      </w:pPr>
+      <w:r>
+        <w:rPr>
+          <w:b/>
+          <w:bCs/>
+          <w:lang w:val="en-GB"/>
+        </w:rPr>
+        <w:t>I solved this by validating the IDs and ensuring they are in the correct format before saving them to the database.</w:t>
+      </w:r>
+    </w:p>
+    <w:p>
+      <w:pPr>
+        <w:rPr>
+          <w:b/>
+          <w:bCs/>
+          <w:lang w:val="en-GB"/>
+        </w:rPr>
+      </w:pPr>
+    </w:p>
+    <w:p>
+      <w:pPr>
+        <w:rPr>
+          <w:b/>
+          <w:bCs/>
+          <w:lang w:val="en-GB"/>
+        </w:rPr>
+      </w:pPr>
+      <w:r>
+        <w:rPr>
+          <w:b/>
+          <w:bCs/>
+          <w:lang w:val="en-GB"/>
+        </w:rPr>
+        <w:t xml:space="preserve">In addition, I implemented relationships between collections using ObjectId references. </w:t>
+      </w:r>
+    </w:p>
+    <w:p>
+      <w:pPr>
+        <w:rPr>
+          <w:b/>
+          <w:bCs/>
+          <w:lang w:val="en-GB"/>
+        </w:rPr>
+      </w:pPr>
+      <w:r>
+        <w:rPr>
+          <w:b/>
+          <w:bCs/>
+          <w:lang w:val="en-GB"/>
+        </w:rPr>
+        <w:t>I used the populate() function to retrieve related data such as movie title and user information.</w:t>
+      </w:r>
+    </w:p>
+    <w:p>
+      <w:pPr>
+        <w:rPr>
+          <w:b/>
+          <w:bCs/>
+          <w:lang w:val="en-GB"/>
+        </w:rPr>
+      </w:pPr>
+    </w:p>
+    <w:p>
+      <w:pPr>
+        <w:rPr>
+          <w:b/>
+          <w:bCs/>
+          <w:lang w:val="en-GB"/>
+        </w:rPr>
+      </w:pPr>
+      <w:r>
+        <w:rPr>
+          <w:b/>
+          <w:bCs/>
+          <w:lang w:val="en-GB"/>
+        </w:rPr>
+        <w:t>Finally, I extended the API by adding new endpoints, such as getting reviews by user and deleting reviews.</w:t>
+      </w:r>
+    </w:p>
+    <w:p>
+      <w:pPr>
+        <w:rPr>
+          <w:b/>
+          <w:bCs/>
+          <w:lang w:val="en-GB"/>
+        </w:rPr>
+      </w:pPr>
+    </w:p>
+    <w:p>
+      <w:r>
+        <w:rPr>
+          <w:b/>
+          <w:bCs/>
+          <w:lang w:val="en-GB"/>
+        </w:rPr>
+        <w:t>Through this project, I learned how React and Express work together, how APIs are structured, and how to manage relational data using MongoDB.</w:t>
+      </w:r>
       <w:r>
         <w:pict w14:anchorId="0523EB7B">
-          <v:rect id="_x0000_i1041" style="width:0;height:1.5pt" o:hralign="center" o:hrstd="t" o:hr="t" fillcolor="#a0a0a0" stroked="f"/>
+          <v:rect id="_x0000_i1029" style="width:0;height:1.5pt" o:hralign="center" o:hrstd="t" o:hr="t" fillcolor="#a0a0a0" stroked="f"/>
         </w:pict>
       </w:r>
     </w:p>
@@ -747,6 +949,7 @@
         <w:rPr>
           <w:lang w:val="en-GB"/>
         </w:rPr>
+        <w:lastRenderedPageBreak/>
         <w:t>This made the project easier to run and more professional.</w:t>
       </w:r>
     </w:p>
@@ -766,7 +969,7 @@
     <w:p>
       <w:r>
         <w:pict w14:anchorId="4E0D7E63">
-          <v:rect id="_x0000_i1042" style="width:0;height:1.5pt" o:hralign="center" o:hrstd="t" o:hr="t" fillcolor="#a0a0a0" stroked="f"/>
+          <v:rect id="_x0000_i1030" style="width:0;height:1.5pt" o:hralign="center" o:hrstd="t" o:hr="t" fillcolor="#a0a0a0" stroked="f"/>
         </w:pict>
       </w:r>
     </w:p>

</xml_diff>

<commit_message>
chore: clean review data (remove null movieId) and verify endpoints
</commit_message>
<xml_diff>
--- a/Report.docx
+++ b/Report.docx
@@ -7,14 +7,12 @@
         <w:rPr>
           <w:b/>
           <w:bCs/>
-          <w:lang w:val="en-GB"/>
-        </w:rPr>
-      </w:pPr>
-      <w:r>
-        <w:rPr>
-          <w:b/>
-          <w:bCs/>
-          <w:lang w:val="en-GB"/>
+        </w:rPr>
+      </w:pPr>
+      <w:r>
+        <w:rPr>
+          <w:b/>
+          <w:bCs/>
         </w:rPr>
         <w:t>Fullstack Movie App Report</w:t>
       </w:r>
@@ -24,14 +22,29 @@
         <w:rPr>
           <w:b/>
           <w:bCs/>
-          <w:lang w:val="en-GB"/>
-        </w:rPr>
-      </w:pPr>
-      <w:r>
-        <w:rPr>
-          <w:b/>
-          <w:bCs/>
-          <w:lang w:val="en-GB"/>
+        </w:rPr>
+      </w:pPr>
+      <w:r>
+        <w:rPr>
+          <w:b/>
+          <w:bCs/>
+        </w:rPr>
+        <w:pict w14:anchorId="07BD62FB">
+          <v:rect id="_x0000_i1097" style="width:0;height:1.5pt" o:hralign="center" o:hrstd="t" o:hr="t" fillcolor="#a0a0a0" stroked="f"/>
+        </w:pict>
+      </w:r>
+    </w:p>
+    <w:p>
+      <w:pPr>
+        <w:rPr>
+          <w:b/>
+          <w:bCs/>
+        </w:rPr>
+      </w:pPr>
+      <w:r>
+        <w:rPr>
+          <w:b/>
+          <w:bCs/>
         </w:rPr>
         <w:t>1. System Overview</w:t>
       </w:r>
@@ -39,40 +52,55 @@
     <w:p>
       <w:pPr>
         <w:rPr>
-          <w:lang w:val="en-GB"/>
-        </w:rPr>
-      </w:pPr>
-      <w:r>
-        <w:rPr>
-          <w:lang w:val="en-GB"/>
-        </w:rPr>
-        <w:t>This project is a simple full stack movie application.</w:t>
-      </w:r>
-      <w:r>
-        <w:rPr>
-          <w:lang w:val="en-GB"/>
+          <w:b/>
+          <w:bCs/>
+        </w:rPr>
+      </w:pPr>
+      <w:r>
+        <w:rPr>
+          <w:b/>
+          <w:bCs/>
+        </w:rPr>
+        <w:t>This project is a full stack movie application built using React, Node.js, Express, and MongoDB.</w:t>
+      </w:r>
+    </w:p>
+    <w:p>
+      <w:pPr>
+        <w:rPr>
+          <w:b/>
+          <w:bCs/>
+        </w:rPr>
+      </w:pPr>
+      <w:r>
+        <w:rPr>
+          <w:b/>
+          <w:bCs/>
+        </w:rPr>
+        <w:t>The goal of the application is to allow users to manage movies, create users, and add reviews linked to both movies and users.</w:t>
+      </w:r>
+      <w:r>
+        <w:rPr>
+          <w:b/>
+          <w:bCs/>
         </w:rPr>
         <w:br/>
-        <w:t>The goal of the app is to allow users to manage a list of movies by adding, viewing, and deleting them.</w:t>
-      </w:r>
-    </w:p>
-    <w:p>
-      <w:pPr>
-        <w:rPr>
-          <w:lang w:val="en-GB"/>
-        </w:rPr>
-      </w:pPr>
-      <w:r>
-        <w:rPr>
-          <w:lang w:val="en-GB"/>
-        </w:rPr>
-        <w:t>The idea is useful for organizing personal movie lists and tracking what movies a user has.</w:t>
-      </w:r>
-    </w:p>
-    <w:p>
-      <w:r>
-        <w:pict w14:anchorId="53F7EE8F">
-          <v:rect id="_x0000_i1025" style="width:0;height:1.5pt" o:hralign="center" o:hrstd="t" o:hr="t" fillcolor="#a0a0a0" stroked="f"/>
+        <w:t>It solves the problem of organizing movie collections and associating them with user-generated reviews in a structured and scalable way.</w:t>
+      </w:r>
+    </w:p>
+    <w:p>
+      <w:pPr>
+        <w:rPr>
+          <w:b/>
+          <w:bCs/>
+        </w:rPr>
+      </w:pPr>
+      <w:r>
+        <w:rPr>
+          <w:b/>
+          <w:bCs/>
+        </w:rPr>
+        <w:pict w14:anchorId="078AF36E">
+          <v:rect id="_x0000_i1098" style="width:0;height:1.5pt" o:hralign="center" o:hrstd="t" o:hr="t" fillcolor="#a0a0a0" stroked="f"/>
         </w:pict>
       </w:r>
     </w:p>
@@ -81,14 +109,12 @@
         <w:rPr>
           <w:b/>
           <w:bCs/>
-          <w:lang w:val="en-GB"/>
-        </w:rPr>
-      </w:pPr>
-      <w:r>
-        <w:rPr>
-          <w:b/>
-          <w:bCs/>
-          <w:lang w:val="en-GB"/>
+        </w:rPr>
+      </w:pPr>
+      <w:r>
+        <w:rPr>
+          <w:b/>
+          <w:bCs/>
         </w:rPr>
         <w:t>2. Database Design</w:t>
       </w:r>
@@ -96,24 +122,34 @@
     <w:p>
       <w:pPr>
         <w:rPr>
-          <w:lang w:val="en-GB"/>
-        </w:rPr>
-      </w:pPr>
-      <w:r>
-        <w:rPr>
-          <w:lang w:val="en-GB"/>
-        </w:rPr>
-        <w:t>The database contains 3 collections:</w:t>
+          <w:b/>
+          <w:bCs/>
+        </w:rPr>
+      </w:pPr>
+      <w:r>
+        <w:rPr>
+          <w:b/>
+          <w:bCs/>
+        </w:rPr>
+        <w:t>The database consists of three main collections:</w:t>
       </w:r>
     </w:p>
     <w:p>
       <w:pPr>
         <w:numPr>
           <w:ilvl w:val="0"/>
-          <w:numId w:val="1"/>
+          <w:numId w:val="6"/>
         </w:numPr>
-      </w:pPr>
-      <w:r>
+        <w:rPr>
+          <w:b/>
+          <w:bCs/>
+        </w:rPr>
+      </w:pPr>
+      <w:r>
+        <w:rPr>
+          <w:b/>
+          <w:bCs/>
+        </w:rPr>
         <w:t>Movies</w:t>
       </w:r>
     </w:p>
@@ -121,10 +157,18 @@
       <w:pPr>
         <w:numPr>
           <w:ilvl w:val="0"/>
-          <w:numId w:val="1"/>
+          <w:numId w:val="6"/>
         </w:numPr>
-      </w:pPr>
-      <w:r>
+        <w:rPr>
+          <w:b/>
+          <w:bCs/>
+        </w:rPr>
+      </w:pPr>
+      <w:r>
+        <w:rPr>
+          <w:b/>
+          <w:bCs/>
+        </w:rPr>
         <w:t>Users</w:t>
       </w:r>
     </w:p>
@@ -132,28 +176,33 @@
       <w:pPr>
         <w:numPr>
           <w:ilvl w:val="0"/>
-          <w:numId w:val="1"/>
+          <w:numId w:val="6"/>
         </w:numPr>
-      </w:pPr>
-      <w:r>
+        <w:rPr>
+          <w:b/>
+          <w:bCs/>
+        </w:rPr>
+      </w:pPr>
+      <w:r>
+        <w:rPr>
+          <w:b/>
+          <w:bCs/>
+        </w:rPr>
         <w:t>Reviews</w:t>
       </w:r>
     </w:p>
     <w:p>
       <w:pPr>
         <w:rPr>
-          <w:lang w:val="en-GB"/>
-        </w:rPr>
-      </w:pPr>
-      <w:r>
-        <w:rPr>
-          <w:lang w:val="en-GB"/>
-        </w:rPr>
-        <w:t>Each collection has its own purpose:</w:t>
-      </w:r>
-    </w:p>
-    <w:p>
-      <w:r>
+          <w:b/>
+          <w:bCs/>
+        </w:rPr>
+      </w:pPr>
+      <w:r>
+        <w:rPr>
+          <w:b/>
+          <w:bCs/>
+        </w:rPr>
         <w:t>Movies:</w:t>
       </w:r>
     </w:p>
@@ -161,10 +210,18 @@
       <w:pPr>
         <w:numPr>
           <w:ilvl w:val="0"/>
-          <w:numId w:val="2"/>
+          <w:numId w:val="7"/>
         </w:numPr>
-      </w:pPr>
-      <w:r>
+        <w:rPr>
+          <w:b/>
+          <w:bCs/>
+        </w:rPr>
+      </w:pPr>
+      <w:r>
+        <w:rPr>
+          <w:b/>
+          <w:bCs/>
+        </w:rPr>
         <w:t>title</w:t>
       </w:r>
     </w:p>
@@ -172,10 +229,18 @@
       <w:pPr>
         <w:numPr>
           <w:ilvl w:val="0"/>
-          <w:numId w:val="2"/>
+          <w:numId w:val="7"/>
         </w:numPr>
-      </w:pPr>
-      <w:r>
+        <w:rPr>
+          <w:b/>
+          <w:bCs/>
+        </w:rPr>
+      </w:pPr>
+      <w:r>
+        <w:rPr>
+          <w:b/>
+          <w:bCs/>
+        </w:rPr>
         <w:t>genre</w:t>
       </w:r>
     </w:p>
@@ -183,10 +248,18 @@
       <w:pPr>
         <w:numPr>
           <w:ilvl w:val="0"/>
-          <w:numId w:val="2"/>
+          <w:numId w:val="7"/>
         </w:numPr>
-      </w:pPr>
-      <w:r>
+        <w:rPr>
+          <w:b/>
+          <w:bCs/>
+        </w:rPr>
+      </w:pPr>
+      <w:r>
+        <w:rPr>
+          <w:b/>
+          <w:bCs/>
+        </w:rPr>
         <w:t>releaseYear</w:t>
       </w:r>
     </w:p>
@@ -194,15 +267,33 @@
       <w:pPr>
         <w:numPr>
           <w:ilvl w:val="0"/>
-          <w:numId w:val="2"/>
+          <w:numId w:val="7"/>
         </w:numPr>
-      </w:pPr>
-      <w:r>
+        <w:rPr>
+          <w:b/>
+          <w:bCs/>
+        </w:rPr>
+      </w:pPr>
+      <w:r>
+        <w:rPr>
+          <w:b/>
+          <w:bCs/>
+        </w:rPr>
         <w:t>averageRating</w:t>
       </w:r>
     </w:p>
     <w:p>
-      <w:r>
+      <w:pPr>
+        <w:rPr>
+          <w:b/>
+          <w:bCs/>
+        </w:rPr>
+      </w:pPr>
+      <w:r>
+        <w:rPr>
+          <w:b/>
+          <w:bCs/>
+        </w:rPr>
         <w:t>Users:</w:t>
       </w:r>
     </w:p>
@@ -210,10 +301,18 @@
       <w:pPr>
         <w:numPr>
           <w:ilvl w:val="0"/>
-          <w:numId w:val="3"/>
+          <w:numId w:val="8"/>
         </w:numPr>
-      </w:pPr>
-      <w:r>
+        <w:rPr>
+          <w:b/>
+          <w:bCs/>
+        </w:rPr>
+      </w:pPr>
+      <w:r>
+        <w:rPr>
+          <w:b/>
+          <w:bCs/>
+        </w:rPr>
         <w:t>name</w:t>
       </w:r>
     </w:p>
@@ -221,15 +320,33 @@
       <w:pPr>
         <w:numPr>
           <w:ilvl w:val="0"/>
-          <w:numId w:val="3"/>
+          <w:numId w:val="8"/>
         </w:numPr>
-      </w:pPr>
-      <w:r>
+        <w:rPr>
+          <w:b/>
+          <w:bCs/>
+        </w:rPr>
+      </w:pPr>
+      <w:r>
+        <w:rPr>
+          <w:b/>
+          <w:bCs/>
+        </w:rPr>
         <w:t>email</w:t>
       </w:r>
     </w:p>
     <w:p>
-      <w:r>
+      <w:pPr>
+        <w:rPr>
+          <w:b/>
+          <w:bCs/>
+        </w:rPr>
+      </w:pPr>
+      <w:r>
+        <w:rPr>
+          <w:b/>
+          <w:bCs/>
+        </w:rPr>
         <w:t>Reviews:</w:t>
       </w:r>
     </w:p>
@@ -237,10 +354,18 @@
       <w:pPr>
         <w:numPr>
           <w:ilvl w:val="0"/>
-          <w:numId w:val="4"/>
+          <w:numId w:val="9"/>
         </w:numPr>
-      </w:pPr>
-      <w:r>
+        <w:rPr>
+          <w:b/>
+          <w:bCs/>
+        </w:rPr>
+      </w:pPr>
+      <w:r>
+        <w:rPr>
+          <w:b/>
+          <w:bCs/>
+        </w:rPr>
         <w:t>movieId (reference to Movie)</w:t>
       </w:r>
     </w:p>
@@ -248,10 +373,18 @@
       <w:pPr>
         <w:numPr>
           <w:ilvl w:val="0"/>
-          <w:numId w:val="4"/>
+          <w:numId w:val="9"/>
         </w:numPr>
-      </w:pPr>
-      <w:r>
+        <w:rPr>
+          <w:b/>
+          <w:bCs/>
+        </w:rPr>
+      </w:pPr>
+      <w:r>
+        <w:rPr>
+          <w:b/>
+          <w:bCs/>
+        </w:rPr>
         <w:t>userId (reference to User)</w:t>
       </w:r>
     </w:p>
@@ -259,10 +392,18 @@
       <w:pPr>
         <w:numPr>
           <w:ilvl w:val="0"/>
-          <w:numId w:val="4"/>
+          <w:numId w:val="9"/>
         </w:numPr>
-      </w:pPr>
-      <w:r>
+        <w:rPr>
+          <w:b/>
+          <w:bCs/>
+        </w:rPr>
+      </w:pPr>
+      <w:r>
+        <w:rPr>
+          <w:b/>
+          <w:bCs/>
+        </w:rPr>
         <w:t>comment</w:t>
       </w:r>
     </w:p>
@@ -270,15 +411,33 @@
       <w:pPr>
         <w:numPr>
           <w:ilvl w:val="0"/>
-          <w:numId w:val="4"/>
+          <w:numId w:val="9"/>
         </w:numPr>
-      </w:pPr>
-      <w:r>
+        <w:rPr>
+          <w:b/>
+          <w:bCs/>
+        </w:rPr>
+      </w:pPr>
+      <w:r>
+        <w:rPr>
+          <w:b/>
+          <w:bCs/>
+        </w:rPr>
         <w:t>rating</w:t>
       </w:r>
     </w:p>
     <w:p>
-      <w:r>
+      <w:pPr>
+        <w:rPr>
+          <w:b/>
+          <w:bCs/>
+        </w:rPr>
+      </w:pPr>
+      <w:r>
+        <w:rPr>
+          <w:b/>
+          <w:bCs/>
+        </w:rPr>
         <w:t>Relationships:</w:t>
       </w:r>
     </w:p>
@@ -286,722 +445,936 @@
       <w:pPr>
         <w:numPr>
           <w:ilvl w:val="0"/>
-          <w:numId w:val="5"/>
+          <w:numId w:val="10"/>
         </w:numPr>
         <w:rPr>
-          <w:lang w:val="en-GB"/>
-        </w:rPr>
-      </w:pPr>
-      <w:r>
-        <w:rPr>
-          <w:lang w:val="en-GB"/>
-        </w:rPr>
-        <w:t>A review is connected to a movie and a user using ObjectId.</w:t>
+          <w:b/>
+          <w:bCs/>
+        </w:rPr>
+      </w:pPr>
+      <w:r>
+        <w:rPr>
+          <w:b/>
+          <w:bCs/>
+        </w:rPr>
+        <w:lastRenderedPageBreak/>
+        <w:t>Each review is linked to a movie and a user using ObjectId references.</w:t>
       </w:r>
     </w:p>
     <w:p>
       <w:pPr>
         <w:numPr>
           <w:ilvl w:val="0"/>
-          <w:numId w:val="5"/>
+          <w:numId w:val="10"/>
         </w:numPr>
         <w:rPr>
+          <w:b/>
+          <w:bCs/>
+        </w:rPr>
+      </w:pPr>
+      <w:r>
+        <w:rPr>
+          <w:b/>
+          <w:bCs/>
+        </w:rPr>
+        <w:t>This allows relational data handling in MongoDB.</w:t>
+      </w:r>
+    </w:p>
+    <w:p>
+      <w:pPr>
+        <w:numPr>
+          <w:ilvl w:val="0"/>
+          <w:numId w:val="10"/>
+        </w:numPr>
+        <w:rPr>
+          <w:b/>
+          <w:bCs/>
+        </w:rPr>
+      </w:pPr>
+      <w:r>
+        <w:rPr>
+          <w:b/>
+          <w:bCs/>
+        </w:rPr>
+        <w:t>I used populate() to retrieve related data such as movie title and user information.</w:t>
+      </w:r>
+    </w:p>
+    <w:p>
+      <w:pPr>
+        <w:rPr>
+          <w:b/>
+          <w:bCs/>
+        </w:rPr>
+      </w:pPr>
+      <w:r>
+        <w:rPr>
+          <w:b/>
+          <w:bCs/>
+        </w:rPr>
+        <w:t>Validation:</w:t>
+      </w:r>
+    </w:p>
+    <w:p>
+      <w:pPr>
+        <w:numPr>
+          <w:ilvl w:val="0"/>
+          <w:numId w:val="11"/>
+        </w:numPr>
+        <w:rPr>
+          <w:b/>
+          <w:bCs/>
+        </w:rPr>
+      </w:pPr>
+      <w:r>
+        <w:rPr>
+          <w:b/>
+          <w:bCs/>
+        </w:rPr>
+        <w:t>Required fields were enforced in schemas.</w:t>
+      </w:r>
+    </w:p>
+    <w:p>
+      <w:pPr>
+        <w:numPr>
+          <w:ilvl w:val="0"/>
+          <w:numId w:val="11"/>
+        </w:numPr>
+        <w:rPr>
+          <w:b/>
+          <w:bCs/>
+        </w:rPr>
+      </w:pPr>
+      <w:r>
+        <w:rPr>
+          <w:b/>
+          <w:bCs/>
+        </w:rPr>
+        <w:t>Rating values were limited using min/max validation.</w:t>
+      </w:r>
+    </w:p>
+    <w:p>
+      <w:pPr>
+        <w:numPr>
+          <w:ilvl w:val="0"/>
+          <w:numId w:val="11"/>
+        </w:numPr>
+        <w:rPr>
+          <w:b/>
+          <w:bCs/>
+        </w:rPr>
+      </w:pPr>
+      <w:r>
+        <w:rPr>
+          <w:b/>
+          <w:bCs/>
+        </w:rPr>
+        <w:t>ObjectId validation was implemented in the backend to prevent invalid data.</w:t>
+      </w:r>
+    </w:p>
+    <w:p>
+      <w:pPr>
+        <w:rPr>
+          <w:b/>
+          <w:bCs/>
+        </w:rPr>
+      </w:pPr>
+      <w:r>
+        <w:rPr>
+          <w:b/>
+          <w:bCs/>
+        </w:rPr>
+        <w:pict w14:anchorId="78A977EF">
+          <v:rect id="_x0000_i1099" style="width:0;height:1.5pt" o:hralign="center" o:hrstd="t" o:hr="t" fillcolor="#a0a0a0" stroked="f"/>
+        </w:pict>
+      </w:r>
+    </w:p>
+    <w:p>
+      <w:pPr>
+        <w:rPr>
+          <w:b/>
+          <w:bCs/>
+        </w:rPr>
+      </w:pPr>
+      <w:r>
+        <w:rPr>
+          <w:b/>
+          <w:bCs/>
+        </w:rPr>
+        <w:t>3. API Endpoints</w:t>
+      </w:r>
+    </w:p>
+    <w:p>
+      <w:pPr>
+        <w:rPr>
+          <w:b/>
+          <w:bCs/>
+        </w:rPr>
+      </w:pPr>
+      <w:r>
+        <w:rPr>
+          <w:b/>
+          <w:bCs/>
+        </w:rPr>
+        <w:t>Movies:</w:t>
+      </w:r>
+    </w:p>
+    <w:p>
+      <w:pPr>
+        <w:numPr>
+          <w:ilvl w:val="0"/>
+          <w:numId w:val="12"/>
+        </w:numPr>
+        <w:rPr>
+          <w:b/>
+          <w:bCs/>
+        </w:rPr>
+      </w:pPr>
+      <w:r>
+        <w:rPr>
+          <w:b/>
+          <w:bCs/>
+        </w:rPr>
+        <w:t>GET /api/movies → Retrieve all movies</w:t>
+      </w:r>
+    </w:p>
+    <w:p>
+      <w:pPr>
+        <w:numPr>
+          <w:ilvl w:val="0"/>
+          <w:numId w:val="12"/>
+        </w:numPr>
+        <w:rPr>
+          <w:b/>
+          <w:bCs/>
+        </w:rPr>
+      </w:pPr>
+      <w:r>
+        <w:rPr>
+          <w:b/>
+          <w:bCs/>
+        </w:rPr>
+        <w:t>POST /api/movies → Add a new movie</w:t>
+      </w:r>
+    </w:p>
+    <w:p>
+      <w:pPr>
+        <w:numPr>
+          <w:ilvl w:val="0"/>
+          <w:numId w:val="12"/>
+        </w:numPr>
+        <w:rPr>
+          <w:b/>
+          <w:bCs/>
+        </w:rPr>
+      </w:pPr>
+      <w:r>
+        <w:rPr>
+          <w:b/>
+          <w:bCs/>
+        </w:rPr>
+        <w:t>PUT /api/movies/:id → Update a movie</w:t>
+      </w:r>
+    </w:p>
+    <w:p>
+      <w:pPr>
+        <w:numPr>
+          <w:ilvl w:val="0"/>
+          <w:numId w:val="12"/>
+        </w:numPr>
+        <w:rPr>
+          <w:b/>
+          <w:bCs/>
+        </w:rPr>
+      </w:pPr>
+      <w:r>
+        <w:rPr>
+          <w:b/>
+          <w:bCs/>
+        </w:rPr>
+        <w:t>DELETE /api/movies/:id → Delete a movie</w:t>
+      </w:r>
+    </w:p>
+    <w:p>
+      <w:pPr>
+        <w:rPr>
+          <w:b/>
+          <w:bCs/>
+        </w:rPr>
+      </w:pPr>
+      <w:r>
+        <w:rPr>
+          <w:b/>
+          <w:bCs/>
+        </w:rPr>
+        <w:t>Users:</w:t>
+      </w:r>
+    </w:p>
+    <w:p>
+      <w:pPr>
+        <w:numPr>
+          <w:ilvl w:val="0"/>
+          <w:numId w:val="13"/>
+        </w:numPr>
+        <w:rPr>
+          <w:b/>
+          <w:bCs/>
+        </w:rPr>
+      </w:pPr>
+      <w:r>
+        <w:rPr>
+          <w:b/>
+          <w:bCs/>
+        </w:rPr>
+        <w:t>GET /api/users → Retrieve all users</w:t>
+      </w:r>
+    </w:p>
+    <w:p>
+      <w:pPr>
+        <w:numPr>
+          <w:ilvl w:val="0"/>
+          <w:numId w:val="13"/>
+        </w:numPr>
+        <w:rPr>
+          <w:b/>
+          <w:bCs/>
+        </w:rPr>
+      </w:pPr>
+      <w:r>
+        <w:rPr>
+          <w:b/>
+          <w:bCs/>
+        </w:rPr>
+        <w:t>POST /api/users → Create a new user</w:t>
+      </w:r>
+    </w:p>
+    <w:p>
+      <w:pPr>
+        <w:rPr>
+          <w:b/>
+          <w:bCs/>
+        </w:rPr>
+      </w:pPr>
+      <w:r>
+        <w:rPr>
+          <w:b/>
+          <w:bCs/>
+        </w:rPr>
+        <w:t>Reviews:</w:t>
+      </w:r>
+    </w:p>
+    <w:p>
+      <w:pPr>
+        <w:numPr>
+          <w:ilvl w:val="0"/>
+          <w:numId w:val="14"/>
+        </w:numPr>
+        <w:rPr>
+          <w:b/>
+          <w:bCs/>
+        </w:rPr>
+      </w:pPr>
+      <w:r>
+        <w:rPr>
+          <w:b/>
+          <w:bCs/>
+        </w:rPr>
+        <w:t>GET /api/reviews → Retrieve all reviews (with populated data)</w:t>
+      </w:r>
+    </w:p>
+    <w:p>
+      <w:pPr>
+        <w:numPr>
+          <w:ilvl w:val="0"/>
+          <w:numId w:val="14"/>
+        </w:numPr>
+        <w:rPr>
+          <w:b/>
+          <w:bCs/>
+        </w:rPr>
+      </w:pPr>
+      <w:r>
+        <w:rPr>
+          <w:b/>
+          <w:bCs/>
+        </w:rPr>
+        <w:t>POST /api/reviews → Add a new review</w:t>
+      </w:r>
+    </w:p>
+    <w:p>
+      <w:pPr>
+        <w:numPr>
+          <w:ilvl w:val="0"/>
+          <w:numId w:val="14"/>
+        </w:numPr>
+        <w:rPr>
+          <w:b/>
+          <w:bCs/>
+        </w:rPr>
+      </w:pPr>
+      <w:r>
+        <w:rPr>
+          <w:b/>
+          <w:bCs/>
+        </w:rPr>
+        <w:t>GET /api/reviews/user/:userId → Get reviews by user</w:t>
+      </w:r>
+    </w:p>
+    <w:p>
+      <w:pPr>
+        <w:numPr>
+          <w:ilvl w:val="0"/>
+          <w:numId w:val="14"/>
+        </w:numPr>
+        <w:rPr>
+          <w:b/>
+          <w:bCs/>
+        </w:rPr>
+      </w:pPr>
+      <w:r>
+        <w:rPr>
+          <w:b/>
+          <w:bCs/>
+        </w:rPr>
+        <w:t>DELETE /api/reviews/:id → Delete a review</w:t>
+      </w:r>
+    </w:p>
+    <w:p>
+      <w:pPr>
+        <w:rPr>
+          <w:b/>
+          <w:bCs/>
+        </w:rPr>
+      </w:pPr>
+      <w:r>
+        <w:rPr>
+          <w:b/>
+          <w:bCs/>
+        </w:rPr>
+        <w:pict w14:anchorId="186AF5C7">
+          <v:rect id="_x0000_i1100" style="width:0;height:1.5pt" o:hralign="center" o:hrstd="t" o:hr="t" fillcolor="#a0a0a0" stroked="f"/>
+        </w:pict>
+      </w:r>
+    </w:p>
+    <w:p>
+      <w:pPr>
+        <w:rPr>
+          <w:b/>
+          <w:bCs/>
+        </w:rPr>
+      </w:pPr>
+      <w:r>
+        <w:rPr>
+          <w:b/>
+          <w:bCs/>
+        </w:rPr>
+        <w:t>4. Reflection</w:t>
+      </w:r>
+    </w:p>
+    <w:p>
+      <w:pPr>
+        <w:rPr>
+          <w:b/>
+          <w:bCs/>
+        </w:rPr>
+      </w:pPr>
+      <w:r>
+        <w:rPr>
+          <w:b/>
+          <w:bCs/>
+        </w:rPr>
+        <w:t>During the development of this project, I faced several challenges.</w:t>
+      </w:r>
+    </w:p>
+    <w:p>
+      <w:pPr>
+        <w:rPr>
+          <w:b/>
+          <w:bCs/>
+        </w:rPr>
+      </w:pPr>
+      <w:r>
+        <w:rPr>
+          <w:b/>
+          <w:bCs/>
+        </w:rPr>
+        <w:t>One of the main challenges was connecting the frontend with the backend correctly.</w:t>
+      </w:r>
+      <w:r>
+        <w:rPr>
+          <w:b/>
+          <w:bCs/>
+        </w:rPr>
+        <w:br/>
+        <w:t xml:space="preserve">At the beginning, some API requests were not working, and I encountered multiple </w:t>
+      </w:r>
+      <w:r>
+        <w:rPr>
+          <w:b/>
+          <w:bCs/>
+        </w:rPr>
+        <w:lastRenderedPageBreak/>
+        <w:t>errors in the console. I resolved this by debugging endpoints and ensuring correct request formatting.</w:t>
+      </w:r>
+    </w:p>
+    <w:p>
+      <w:pPr>
+        <w:rPr>
+          <w:b/>
+          <w:bCs/>
+        </w:rPr>
+      </w:pPr>
+      <w:r>
+        <w:rPr>
+          <w:b/>
+          <w:bCs/>
+        </w:rPr>
+        <w:t>Another issue was handling empty inputs in forms.</w:t>
+      </w:r>
+      <w:r>
+        <w:rPr>
+          <w:b/>
+          <w:bCs/>
+        </w:rPr>
+        <w:br/>
+        <w:t>Submitting incomplete data caused errors, so I implemented validation in the frontend to ensure all required fields are filled.</w:t>
+      </w:r>
+    </w:p>
+    <w:p>
+      <w:pPr>
+        <w:rPr>
+          <w:b/>
+          <w:bCs/>
+        </w:rPr>
+      </w:pPr>
+      <w:r>
+        <w:rPr>
+          <w:b/>
+          <w:bCs/>
+        </w:rPr>
+        <w:t>I also faced a Git-related issue where I accidentally committed the node_modules folder, which made the repository very large.</w:t>
+      </w:r>
+      <w:r>
+        <w:rPr>
+          <w:b/>
+          <w:bCs/>
+        </w:rPr>
+        <w:br/>
+        <w:t>I fixed this by adding a .gitignore file and removing node_modules from version control.</w:t>
+      </w:r>
+    </w:p>
+    <w:p>
+      <w:pPr>
+        <w:rPr>
+          <w:b/>
+          <w:bCs/>
+        </w:rPr>
+      </w:pPr>
+      <w:r>
+        <w:rPr>
+          <w:b/>
+          <w:bCs/>
+        </w:rPr>
+        <w:t>A significant challenge was handling ObjectId validation when creating reviews.</w:t>
+      </w:r>
+      <w:r>
+        <w:rPr>
+          <w:b/>
+          <w:bCs/>
+        </w:rPr>
+        <w:br/>
+        <w:t>Initially, I received errors when sending userId and movieId. I solved this by validating IDs using Mongoose and ensuring proper conversion before saving them.</w:t>
+      </w:r>
+    </w:p>
+    <w:p>
+      <w:pPr>
+        <w:rPr>
+          <w:b/>
+          <w:bCs/>
+        </w:rPr>
+      </w:pPr>
+      <w:r>
+        <w:rPr>
+          <w:b/>
+          <w:bCs/>
+        </w:rPr>
+        <w:t>Additionally, I implemented relationships between collections using ObjectId references and used the populate() function to retrieve related data such as movie titles and user details.</w:t>
+      </w:r>
+    </w:p>
+    <w:p>
+      <w:pPr>
+        <w:rPr>
+          <w:b/>
+          <w:bCs/>
+        </w:rPr>
+      </w:pPr>
+      <w:r>
+        <w:rPr>
+          <w:b/>
+          <w:bCs/>
+        </w:rPr>
+        <w:t>I also improved the backend structure by introducing a controller layer, separating logic from routes, following the pattern:</w:t>
+      </w:r>
+      <w:r>
+        <w:rPr>
+          <w:b/>
+          <w:bCs/>
+        </w:rPr>
+        <w:br/>
+        <w:t>routes → controllers → models.</w:t>
+      </w:r>
+    </w:p>
+    <w:p>
+      <w:pPr>
+        <w:rPr>
+          <w:b/>
+          <w:bCs/>
+        </w:rPr>
+      </w:pPr>
+      <w:r>
+        <w:rPr>
+          <w:b/>
+          <w:bCs/>
+        </w:rPr>
+        <w:t>Finally, I extended the API by adding new endpoints such as retrieving reviews by user and deleting reviews.</w:t>
+      </w:r>
+    </w:p>
+    <w:p>
+      <w:pPr>
+        <w:rPr>
+          <w:b/>
+          <w:bCs/>
+        </w:rPr>
+      </w:pPr>
+      <w:r>
+        <w:rPr>
+          <w:b/>
+          <w:bCs/>
+        </w:rPr>
+        <w:t>Through this project, I learned how React and Express integrate, how APIs are designed, and how to manage relational data using MongoDB effectively.</w:t>
+      </w:r>
+    </w:p>
+    <w:p>
+      <w:pPr>
+        <w:rPr>
+          <w:b/>
+          <w:bCs/>
+        </w:rPr>
+      </w:pPr>
+      <w:r>
+        <w:rPr>
+          <w:b/>
+          <w:bCs/>
+        </w:rPr>
+        <w:pict w14:anchorId="5A6380C6">
+          <v:rect id="_x0000_i1101" style="width:0;height:1.5pt" o:hralign="center" o:hrstd="t" o:hr="t" fillcolor="#a0a0a0" stroked="f"/>
+        </w:pict>
+      </w:r>
+    </w:p>
+    <w:p>
+      <w:pPr>
+        <w:rPr>
+          <w:b/>
+          <w:bCs/>
+        </w:rPr>
+      </w:pPr>
+      <w:r>
+        <w:rPr>
+          <w:b/>
+          <w:bCs/>
+        </w:rPr>
+        <w:t>5. Feature Iteration</w:t>
+      </w:r>
+    </w:p>
+    <w:p>
+      <w:pPr>
+        <w:rPr>
+          <w:b/>
+          <w:bCs/>
+        </w:rPr>
+      </w:pPr>
+      <w:r>
+        <w:rPr>
+          <w:b/>
+          <w:bCs/>
+        </w:rPr>
+        <w:t>One feature I improved was how the application runs.</w:t>
+      </w:r>
+    </w:p>
+    <w:p>
+      <w:pPr>
+        <w:rPr>
+          <w:b/>
+          <w:bCs/>
+        </w:rPr>
+      </w:pPr>
+      <w:r>
+        <w:rPr>
+          <w:b/>
+          <w:bCs/>
+        </w:rPr>
+        <w:t>Initially, I ran the backend and frontend separately using:</w:t>
+      </w:r>
+    </w:p>
+    <w:p>
+      <w:pPr>
+        <w:numPr>
+          <w:ilvl w:val="0"/>
+          <w:numId w:val="15"/>
+        </w:numPr>
+        <w:rPr>
+          <w:b/>
+          <w:bCs/>
+        </w:rPr>
+      </w:pPr>
+      <w:r>
+        <w:rPr>
+          <w:b/>
+          <w:bCs/>
+        </w:rPr>
+        <w:t>node index.js</w:t>
+      </w:r>
+    </w:p>
+    <w:p>
+      <w:pPr>
+        <w:numPr>
+          <w:ilvl w:val="0"/>
+          <w:numId w:val="15"/>
+        </w:numPr>
+        <w:rPr>
+          <w:b/>
+          <w:bCs/>
+        </w:rPr>
+      </w:pPr>
+      <w:r>
+        <w:rPr>
+          <w:b/>
+          <w:bCs/>
+        </w:rPr>
+        <w:t>npm run dev</w:t>
+      </w:r>
+    </w:p>
+    <w:p>
+      <w:pPr>
+        <w:rPr>
+          <w:b/>
+          <w:bCs/>
+        </w:rPr>
+      </w:pPr>
+      <w:r>
+        <w:rPr>
+          <w:b/>
+          <w:bCs/>
+        </w:rPr>
+        <w:t>Later, I improved this by using a single command:</w:t>
+      </w:r>
+    </w:p>
+    <w:p>
+      <w:pPr>
+        <w:numPr>
+          <w:ilvl w:val="0"/>
+          <w:numId w:val="16"/>
+        </w:numPr>
+        <w:rPr>
+          <w:b/>
+          <w:bCs/>
+        </w:rPr>
+      </w:pPr>
+      <w:r>
+        <w:rPr>
+          <w:b/>
+          <w:bCs/>
+        </w:rPr>
+        <w:t>npm run dev</w:t>
+      </w:r>
+    </w:p>
+    <w:p>
+      <w:pPr>
+        <w:rPr>
+          <w:b/>
+          <w:bCs/>
+        </w:rPr>
+      </w:pPr>
+      <w:r>
+        <w:rPr>
+          <w:b/>
+          <w:bCs/>
+        </w:rPr>
+        <w:t>This made the workflow more efficient and professional.</w:t>
+      </w:r>
+    </w:p>
+    <w:p>
+      <w:pPr>
+        <w:rPr>
+          <w:b/>
+          <w:bCs/>
+        </w:rPr>
+      </w:pPr>
+      <w:r>
+        <w:rPr>
+          <w:b/>
+          <w:bCs/>
+        </w:rPr>
+        <w:t>Another improvement was adding loading indicators and error handling in the frontend, instead of displaying an empty screen during data fetching.</w:t>
+      </w:r>
+    </w:p>
+    <w:p>
+      <w:pPr>
+        <w:rPr>
+          <w:b/>
+          <w:bCs/>
+        </w:rPr>
+      </w:pPr>
+      <w:r>
+        <w:rPr>
+          <w:b/>
+          <w:bCs/>
+        </w:rPr>
+        <w:lastRenderedPageBreak/>
+        <w:pict w14:anchorId="36500F96">
+          <v:rect id="_x0000_i1102" style="width:0;height:1.5pt" o:hralign="center" o:hrstd="t" o:hr="t" fillcolor="#a0a0a0" stroked="f"/>
+        </w:pict>
+      </w:r>
+    </w:p>
+    <w:p>
+      <w:pPr>
+        <w:rPr>
+          <w:b/>
+          <w:bCs/>
+        </w:rPr>
+      </w:pPr>
+      <w:r>
+        <w:rPr>
+          <w:b/>
+          <w:bCs/>
+        </w:rPr>
+        <w:t>Conclusion</w:t>
+      </w:r>
+    </w:p>
+    <w:p>
+      <w:pPr>
+        <w:rPr>
+          <w:b/>
+          <w:bCs/>
+        </w:rPr>
+      </w:pPr>
+      <w:r>
+        <w:rPr>
+          <w:b/>
+          <w:bCs/>
+        </w:rPr>
+        <w:t>This project enhanced my understanding of full stack development, especially how different layers of an application interact together.</w:t>
+      </w:r>
+    </w:p>
+    <w:p>
+      <w:pPr>
+        <w:rPr>
+          <w:b/>
+          <w:bCs/>
+        </w:rPr>
+      </w:pPr>
+      <w:r>
+        <w:rPr>
+          <w:b/>
+          <w:bCs/>
+        </w:rPr>
+        <w:t>I gained practical experience in building APIs, structuring backend code, managing databases, and connecting frontend interfaces with backend services.</w:t>
+      </w:r>
+    </w:p>
+    <w:p>
+      <w:pPr>
+        <w:rPr>
+          <w:b/>
+          <w:bCs/>
+        </w:rPr>
+      </w:pPr>
+      <w:r>
+        <w:rPr>
+          <w:b/>
+          <w:bCs/>
+        </w:rPr>
+        <w:pict w14:anchorId="3872B74C">
+          <v:rect id="_x0000_i1103" style="width:0;height:1.5pt" o:hralign="center" o:hrstd="t" o:hr="t" fillcolor="#a0a0a0" stroked="f"/>
+        </w:pict>
+      </w:r>
+    </w:p>
+    <w:p>
+      <w:pPr>
+        <w:rPr>
+          <w:b/>
+          <w:bCs/>
+        </w:rPr>
+      </w:pPr>
+      <w:r>
+        <w:rPr>
+          <w:b/>
+          <w:bCs/>
+        </w:rPr>
+        <w:t>ERD Diagram</w:t>
+      </w:r>
+    </w:p>
+    <w:p>
+      <w:pPr>
+        <w:numPr>
+          <w:ilvl w:val="0"/>
+          <w:numId w:val="17"/>
+        </w:numPr>
+        <w:rPr>
+          <w:b/>
+          <w:bCs/>
+        </w:rPr>
+      </w:pPr>
+      <w:r>
+        <w:rPr>
+          <w:b/>
+          <w:bCs/>
+        </w:rPr>
+        <w:t>A User writes Reviews</w:t>
+      </w:r>
+    </w:p>
+    <w:p>
+      <w:pPr>
+        <w:numPr>
+          <w:ilvl w:val="0"/>
+          <w:numId w:val="17"/>
+        </w:numPr>
+        <w:rPr>
+          <w:b/>
+          <w:bCs/>
+        </w:rPr>
+      </w:pPr>
+      <w:r>
+        <w:rPr>
+          <w:b/>
+          <w:bCs/>
+        </w:rPr>
+        <w:t>A Movie has Reviews</w:t>
+      </w:r>
+    </w:p>
+    <w:p>
+      <w:pPr>
+        <w:numPr>
+          <w:ilvl w:val="0"/>
+          <w:numId w:val="17"/>
+        </w:numPr>
+        <w:rPr>
+          <w:b/>
+          <w:bCs/>
+        </w:rPr>
+      </w:pPr>
+      <w:r>
+        <w:rPr>
+          <w:b/>
+          <w:bCs/>
+        </w:rPr>
+        <w:t>Reviews connect Users and Movies</w:t>
+      </w:r>
+    </w:p>
+    <w:p>
+      <w:pPr>
+        <w:rPr>
           <w:lang w:val="en-GB"/>
         </w:rPr>
       </w:pPr>
-      <w:r>
-        <w:rPr>
-          <w:lang w:val="en-GB"/>
-        </w:rPr>
-        <w:lastRenderedPageBreak/>
-        <w:t>This allows linking data between collections.</w:t>
-      </w:r>
-    </w:p>
-    <w:p>
-      <w:pPr>
-        <w:rPr>
-          <w:lang w:val="en-GB"/>
-        </w:rPr>
-      </w:pPr>
-      <w:r>
-        <w:rPr>
-          <w:lang w:val="en-GB"/>
-        </w:rPr>
-        <w:t>I also used validation in the schema like required fields and min/max rating.</w:t>
-      </w:r>
-    </w:p>
-    <w:p>
-      <w:r>
-        <w:pict w14:anchorId="6987BBEA">
-          <v:rect id="_x0000_i1026" style="width:0;height:1.5pt" o:hralign="center" o:hrstd="t" o:hr="t" fillcolor="#a0a0a0" stroked="f"/>
-        </w:pict>
-      </w:r>
-    </w:p>
-    <w:p>
-      <w:pPr>
-        <w:rPr>
-          <w:b/>
-          <w:bCs/>
-          <w:lang w:val="en-GB"/>
-        </w:rPr>
-      </w:pPr>
-      <w:r>
-        <w:rPr>
-          <w:b/>
-          <w:bCs/>
-          <w:lang w:val="en-GB"/>
-        </w:rPr>
-        <w:t>3. API Endpoints</w:t>
-      </w:r>
-    </w:p>
-    <w:p>
-      <w:pPr>
-        <w:rPr>
-          <w:b/>
-          <w:bCs/>
-          <w:lang w:val="en-GB"/>
-        </w:rPr>
-      </w:pPr>
-      <w:r>
-        <w:rPr>
-          <w:b/>
-          <w:bCs/>
-          <w:lang w:val="en-GB"/>
-        </w:rPr>
-        <w:t>1. Get all movies</w:t>
-      </w:r>
-    </w:p>
-    <w:p>
-      <w:pPr>
-        <w:rPr>
-          <w:lang w:val="en-GB"/>
-        </w:rPr>
-      </w:pPr>
-      <w:r>
-        <w:rPr>
-          <w:lang w:val="en-GB"/>
-        </w:rPr>
-        <w:t>GET /api/movies</w:t>
-      </w:r>
-    </w:p>
-    <w:p>
-      <w:pPr>
-        <w:rPr>
-          <w:lang w:val="en-GB"/>
-        </w:rPr>
-      </w:pPr>
-      <w:r>
-        <w:rPr>
-          <w:lang w:val="en-GB"/>
-        </w:rPr>
-        <w:t>This endpoint returns all movies from the database.</w:t>
-      </w:r>
-    </w:p>
-    <w:p>
-      <w:pPr>
-        <w:rPr>
-          <w:lang w:val="en-GB"/>
-        </w:rPr>
-      </w:pPr>
-      <w:r>
-        <w:rPr>
-          <w:lang w:val="en-GB"/>
-        </w:rPr>
-        <w:t>Example response:</w:t>
-      </w:r>
-      <w:r>
-        <w:rPr>
-          <w:lang w:val="en-GB"/>
-        </w:rPr>
-        <w:br/>
-        <w:t>[</w:t>
-      </w:r>
-      <w:r>
-        <w:rPr>
-          <w:lang w:val="en-GB"/>
-        </w:rPr>
-        <w:br/>
-        <w:t>{</w:t>
-      </w:r>
-      <w:r>
-        <w:rPr>
-          <w:lang w:val="en-GB"/>
-        </w:rPr>
-        <w:br/>
-        <w:t>"_id": "...",</w:t>
-      </w:r>
-      <w:r>
-        <w:rPr>
-          <w:lang w:val="en-GB"/>
-        </w:rPr>
-        <w:br/>
-        <w:t>"title": "Inception",</w:t>
-      </w:r>
-      <w:r>
-        <w:rPr>
-          <w:lang w:val="en-GB"/>
-        </w:rPr>
-        <w:br/>
-        <w:t>"genre": "Sci-Fi"</w:t>
-      </w:r>
-      <w:r>
-        <w:rPr>
-          <w:lang w:val="en-GB"/>
-        </w:rPr>
-        <w:br/>
-        <w:t>}</w:t>
-      </w:r>
-      <w:r>
-        <w:rPr>
-          <w:lang w:val="en-GB"/>
-        </w:rPr>
-        <w:br/>
-        <w:t>]</w:t>
-      </w:r>
-    </w:p>
-    <w:p>
-      <w:r>
-        <w:pict w14:anchorId="1740E34A">
-          <v:rect id="_x0000_i1027" style="width:0;height:1.5pt" o:hralign="center" o:hrstd="t" o:hr="t" fillcolor="#a0a0a0" stroked="f"/>
-        </w:pict>
-      </w:r>
-    </w:p>
-    <w:p>
-      <w:pPr>
-        <w:rPr>
-          <w:b/>
-          <w:bCs/>
-          <w:lang w:val="en-GB"/>
-        </w:rPr>
-      </w:pPr>
-      <w:r>
-        <w:rPr>
-          <w:b/>
-          <w:bCs/>
-          <w:lang w:val="en-GB"/>
-        </w:rPr>
-        <w:t>2. Delete a movie</w:t>
-      </w:r>
-    </w:p>
-    <w:p>
-      <w:pPr>
-        <w:rPr>
-          <w:lang w:val="en-GB"/>
-        </w:rPr>
-      </w:pPr>
-      <w:r>
-        <w:rPr>
-          <w:lang w:val="en-GB"/>
-        </w:rPr>
-        <w:t>DELETE /api/movies/:id</w:t>
-      </w:r>
-    </w:p>
-    <w:p>
-      <w:pPr>
-        <w:rPr>
-          <w:lang w:val="en-GB"/>
-        </w:rPr>
-      </w:pPr>
-      <w:r>
-        <w:rPr>
-          <w:lang w:val="en-GB"/>
-        </w:rPr>
-        <w:t>This endpoint deletes a movie using its ID.</w:t>
-      </w:r>
-    </w:p>
-    <w:p>
-      <w:pPr>
-        <w:rPr>
-          <w:lang w:val="en-GB"/>
-        </w:rPr>
-      </w:pPr>
-      <w:r>
-        <w:rPr>
-          <w:lang w:val="en-GB"/>
-        </w:rPr>
-        <w:t>Example response:</w:t>
-      </w:r>
-      <w:r>
-        <w:rPr>
-          <w:lang w:val="en-GB"/>
-        </w:rPr>
-        <w:br/>
-        <w:t>{</w:t>
-      </w:r>
-      <w:r>
-        <w:rPr>
-          <w:lang w:val="en-GB"/>
-        </w:rPr>
-        <w:br/>
-        <w:t>"message": "Movie deleted successfully"</w:t>
-      </w:r>
-      <w:r>
-        <w:rPr>
-          <w:lang w:val="en-GB"/>
-        </w:rPr>
-        <w:br/>
-        <w:t>}</w:t>
-      </w:r>
-    </w:p>
-    <w:p>
-      <w:r>
-        <w:pict w14:anchorId="2F5C5B36">
-          <v:rect id="_x0000_i1028" style="width:0;height:1.5pt" o:hralign="center" o:hrstd="t" o:hr="t" fillcolor="#a0a0a0" stroked="f"/>
-        </w:pict>
-      </w:r>
-    </w:p>
-    <w:p>
-      <w:pPr>
-        <w:rPr>
-          <w:b/>
-          <w:bCs/>
-          <w:lang w:val="en-GB"/>
-        </w:rPr>
-      </w:pPr>
-      <w:r>
-        <w:rPr>
-          <w:b/>
-          <w:bCs/>
-          <w:lang w:val="en-GB"/>
-        </w:rPr>
-        <w:t>4. Reflection</w:t>
-      </w:r>
-    </w:p>
-    <w:p>
-      <w:pPr>
-        <w:rPr>
-          <w:b/>
-          <w:bCs/>
-          <w:lang w:val="en-GB"/>
-        </w:rPr>
-      </w:pPr>
-    </w:p>
-    <w:p>
-      <w:pPr>
-        <w:rPr>
-          <w:b/>
-          <w:bCs/>
-          <w:lang w:val="en-GB"/>
-        </w:rPr>
-      </w:pPr>
-      <w:r>
-        <w:rPr>
-          <w:b/>
-          <w:bCs/>
-          <w:lang w:val="en-GB"/>
-        </w:rPr>
-        <w:t xml:space="preserve">One challenge I faced was connecting the frontend with the backend correctly. </w:t>
-      </w:r>
-    </w:p>
-    <w:p>
-      <w:pPr>
-        <w:rPr>
-          <w:b/>
-          <w:bCs/>
-          <w:lang w:val="en-GB"/>
-        </w:rPr>
-      </w:pPr>
-      <w:r>
-        <w:rPr>
-          <w:b/>
-          <w:bCs/>
-          <w:lang w:val="en-GB"/>
-        </w:rPr>
-        <w:t>At the beginning, I had issues with requests not working and errors appearing in the console.</w:t>
-      </w:r>
-    </w:p>
-    <w:p>
-      <w:pPr>
-        <w:rPr>
-          <w:b/>
-          <w:bCs/>
-          <w:lang w:val="en-GB"/>
-        </w:rPr>
-      </w:pPr>
-    </w:p>
-    <w:p>
-      <w:pPr>
-        <w:rPr>
-          <w:b/>
-          <w:bCs/>
-          <w:lang w:val="en-GB"/>
-        </w:rPr>
-      </w:pPr>
-      <w:r>
-        <w:rPr>
-          <w:b/>
-          <w:bCs/>
-          <w:lang w:val="en-GB"/>
-        </w:rPr>
-        <w:t xml:space="preserve">Another issue was handling empty inputs in the form. </w:t>
-      </w:r>
-    </w:p>
-    <w:p>
-      <w:pPr>
-        <w:rPr>
-          <w:b/>
-          <w:bCs/>
-          <w:lang w:val="en-GB"/>
-        </w:rPr>
-      </w:pPr>
-      <w:r>
-        <w:rPr>
-          <w:b/>
-          <w:bCs/>
-          <w:lang w:val="en-GB"/>
-        </w:rPr>
-        <w:lastRenderedPageBreak/>
-        <w:t>When I tried to add a movie without filling all fields, it caused problems, so I added validation in the frontend.</w:t>
-      </w:r>
-    </w:p>
-    <w:p>
-      <w:pPr>
-        <w:rPr>
-          <w:b/>
-          <w:bCs/>
-          <w:lang w:val="en-GB"/>
-        </w:rPr>
-      </w:pPr>
-    </w:p>
-    <w:p>
-      <w:pPr>
-        <w:rPr>
-          <w:b/>
-          <w:bCs/>
-          <w:lang w:val="en-GB"/>
-        </w:rPr>
-      </w:pPr>
-      <w:r>
-        <w:rPr>
-          <w:b/>
-          <w:bCs/>
-          <w:lang w:val="en-GB"/>
-        </w:rPr>
-        <w:t xml:space="preserve">I also faced a problem with Git where I accidentally committed the node_modules folder, which made the project very large. </w:t>
-      </w:r>
-    </w:p>
-    <w:p>
-      <w:pPr>
-        <w:rPr>
-          <w:b/>
-          <w:bCs/>
-          <w:lang w:val="en-GB"/>
-        </w:rPr>
-      </w:pPr>
-      <w:r>
-        <w:rPr>
-          <w:b/>
-          <w:bCs/>
-          <w:lang w:val="en-GB"/>
-        </w:rPr>
-        <w:t>I fixed this by using a .gitignore file and removing node_modules from the repository.</w:t>
-      </w:r>
-    </w:p>
-    <w:p>
-      <w:pPr>
-        <w:rPr>
-          <w:b/>
-          <w:bCs/>
-          <w:lang w:val="en-GB"/>
-        </w:rPr>
-      </w:pPr>
-    </w:p>
-    <w:p>
-      <w:pPr>
-        <w:rPr>
-          <w:b/>
-          <w:bCs/>
-          <w:lang w:val="en-GB"/>
-        </w:rPr>
-      </w:pPr>
-      <w:r>
-        <w:rPr>
-          <w:b/>
-          <w:bCs/>
-          <w:lang w:val="en-GB"/>
-        </w:rPr>
-        <w:t xml:space="preserve">Another challenge was handling ObjectId validation when creating reviews. </w:t>
-      </w:r>
-    </w:p>
-    <w:p>
-      <w:pPr>
-        <w:rPr>
-          <w:b/>
-          <w:bCs/>
-          <w:lang w:val="en-GB"/>
-        </w:rPr>
-      </w:pPr>
-      <w:r>
-        <w:rPr>
-          <w:b/>
-          <w:bCs/>
-          <w:lang w:val="en-GB"/>
-        </w:rPr>
-        <w:t xml:space="preserve">Initially, I received errors when sending userId and movieId. </w:t>
-      </w:r>
-    </w:p>
-    <w:p>
-      <w:pPr>
-        <w:rPr>
-          <w:b/>
-          <w:bCs/>
-          <w:lang w:val="en-GB"/>
-        </w:rPr>
-      </w:pPr>
-      <w:r>
-        <w:rPr>
-          <w:b/>
-          <w:bCs/>
-          <w:lang w:val="en-GB"/>
-        </w:rPr>
-        <w:t>I solved this by validating the IDs and ensuring they are in the correct format before saving them to the database.</w:t>
-      </w:r>
-    </w:p>
-    <w:p>
-      <w:pPr>
-        <w:rPr>
-          <w:b/>
-          <w:bCs/>
-          <w:lang w:val="en-GB"/>
-        </w:rPr>
-      </w:pPr>
-    </w:p>
-    <w:p>
-      <w:pPr>
-        <w:rPr>
-          <w:b/>
-          <w:bCs/>
-          <w:lang w:val="en-GB"/>
-        </w:rPr>
-      </w:pPr>
-      <w:r>
-        <w:rPr>
-          <w:b/>
-          <w:bCs/>
-          <w:lang w:val="en-GB"/>
-        </w:rPr>
-        <w:t xml:space="preserve">In addition, I implemented relationships between collections using ObjectId references. </w:t>
-      </w:r>
-    </w:p>
-    <w:p>
-      <w:pPr>
-        <w:rPr>
-          <w:b/>
-          <w:bCs/>
-          <w:lang w:val="en-GB"/>
-        </w:rPr>
-      </w:pPr>
-      <w:r>
-        <w:rPr>
-          <w:b/>
-          <w:bCs/>
-          <w:lang w:val="en-GB"/>
-        </w:rPr>
-        <w:t>I used the populate() function to retrieve related data such as movie title and user information.</w:t>
-      </w:r>
-    </w:p>
-    <w:p>
-      <w:pPr>
-        <w:rPr>
-          <w:b/>
-          <w:bCs/>
-          <w:lang w:val="en-GB"/>
-        </w:rPr>
-      </w:pPr>
-    </w:p>
-    <w:p>
-      <w:pPr>
-        <w:rPr>
-          <w:b/>
-          <w:bCs/>
-          <w:lang w:val="en-GB"/>
-        </w:rPr>
-      </w:pPr>
-      <w:r>
-        <w:rPr>
-          <w:b/>
-          <w:bCs/>
-          <w:lang w:val="en-GB"/>
-        </w:rPr>
-        <w:t>Finally, I extended the API by adding new endpoints, such as getting reviews by user and deleting reviews.</w:t>
-      </w:r>
-    </w:p>
-    <w:p>
-      <w:pPr>
-        <w:rPr>
-          <w:b/>
-          <w:bCs/>
-          <w:lang w:val="en-GB"/>
-        </w:rPr>
-      </w:pPr>
-    </w:p>
-    <w:p>
-      <w:r>
-        <w:rPr>
-          <w:b/>
-          <w:bCs/>
-          <w:lang w:val="en-GB"/>
-        </w:rPr>
-        <w:t>Through this project, I learned how React and Express work together, how APIs are structured, and how to manage relational data using MongoDB.</w:t>
-      </w:r>
-      <w:r>
-        <w:pict w14:anchorId="0523EB7B">
-          <v:rect id="_x0000_i1029" style="width:0;height:1.5pt" o:hralign="center" o:hrstd="t" o:hr="t" fillcolor="#a0a0a0" stroked="f"/>
-        </w:pict>
-      </w:r>
-    </w:p>
-    <w:p>
-      <w:pPr>
-        <w:rPr>
-          <w:b/>
-          <w:bCs/>
-          <w:lang w:val="en-GB"/>
-        </w:rPr>
-      </w:pPr>
-      <w:r>
-        <w:rPr>
-          <w:b/>
-          <w:bCs/>
-          <w:lang w:val="en-GB"/>
-        </w:rPr>
-        <w:t>5. Feature Iteration</w:t>
-      </w:r>
-    </w:p>
-    <w:p>
-      <w:pPr>
-        <w:rPr>
-          <w:lang w:val="en-GB"/>
-        </w:rPr>
-      </w:pPr>
-      <w:r>
-        <w:rPr>
-          <w:lang w:val="en-GB"/>
-        </w:rPr>
-        <w:t>One feature that I improved was running the project.</w:t>
-      </w:r>
-    </w:p>
-    <w:p>
-      <w:pPr>
-        <w:rPr>
-          <w:lang w:val="en-GB"/>
-        </w:rPr>
-      </w:pPr>
-      <w:r>
-        <w:rPr>
-          <w:lang w:val="en-GB"/>
-        </w:rPr>
-        <w:t>At first, I was running the backend and frontend separately using two commands:</w:t>
-      </w:r>
-    </w:p>
-    <w:p>
-      <w:pPr>
-        <w:rPr>
-          <w:lang w:val="en-GB"/>
-        </w:rPr>
-      </w:pPr>
-      <w:r>
-        <w:rPr>
-          <w:lang w:val="en-GB"/>
-        </w:rPr>
-        <w:t>node index.js</w:t>
-      </w:r>
-      <w:r>
-        <w:rPr>
-          <w:lang w:val="en-GB"/>
-        </w:rPr>
-        <w:br/>
-        <w:t>npm run dev</w:t>
-      </w:r>
-    </w:p>
-    <w:p>
-      <w:pPr>
-        <w:rPr>
-          <w:lang w:val="en-GB"/>
-        </w:rPr>
-      </w:pPr>
-      <w:r>
-        <w:rPr>
-          <w:lang w:val="en-GB"/>
-        </w:rPr>
-        <w:t>Later, I improved this by using concurrently to run both with one command:</w:t>
-      </w:r>
-    </w:p>
-    <w:p>
-      <w:pPr>
-        <w:rPr>
-          <w:lang w:val="en-GB"/>
-        </w:rPr>
-      </w:pPr>
-      <w:r>
-        <w:rPr>
-          <w:lang w:val="en-GB"/>
-        </w:rPr>
-        <w:t>npm run dev</w:t>
-      </w:r>
-    </w:p>
-    <w:p>
-      <w:pPr>
-        <w:rPr>
-          <w:lang w:val="en-GB"/>
-        </w:rPr>
-      </w:pPr>
-      <w:r>
-        <w:rPr>
-          <w:lang w:val="en-GB"/>
-        </w:rPr>
-        <w:lastRenderedPageBreak/>
-        <w:t>This made the project easier to run and more professional.</w:t>
-      </w:r>
-    </w:p>
-    <w:p>
-      <w:pPr>
-        <w:rPr>
-          <w:lang w:val="en-GB"/>
-        </w:rPr>
-      </w:pPr>
-      <w:r>
-        <w:rPr>
-          <w:lang w:val="en-GB"/>
-        </w:rPr>
-        <w:t>Another small improvement was adding loading and error handling in the frontend instead of having an empty screen.</w:t>
-      </w:r>
-    </w:p>
-    <w:p>
-      <w:r>
-        <w:pict w14:anchorId="4E0D7E63">
-          <v:rect id="_x0000_i1030" style="width:0;height:1.5pt" o:hralign="center" o:hrstd="t" o:hr="t" fillcolor="#a0a0a0" stroked="f"/>
-        </w:pict>
-      </w:r>
-    </w:p>
-    <w:p>
-      <w:pPr>
-        <w:rPr>
-          <w:b/>
-          <w:bCs/>
-          <w:lang w:val="en-GB"/>
-        </w:rPr>
-      </w:pPr>
-      <w:r>
-        <w:rPr>
-          <w:b/>
-          <w:bCs/>
-          <w:lang w:val="en-GB"/>
-        </w:rPr>
-        <w:t>Conclusion</w:t>
-      </w:r>
-    </w:p>
-    <w:p>
-      <w:pPr>
-        <w:rPr>
-          <w:lang w:val="en-GB"/>
-        </w:rPr>
-      </w:pPr>
-      <w:r>
-        <w:rPr>
-          <w:lang w:val="en-GB"/>
-        </w:rPr>
-        <w:t>This project helped me understand fullstack development better, especially how different parts of the system connect together.</w:t>
-      </w:r>
       <w:r>
         <w:rPr>
           <w:rtl/>
@@ -1759,6 +2132,304 @@
 <file path=word/numbering.xml><?xml version="1.0" encoding="utf-8"?>
 <w:numbering xmlns:wpc="http://schemas.microsoft.com/office/word/2010/wordprocessingCanvas" xmlns:cx="http://schemas.microsoft.com/office/drawing/2014/chartex" xmlns:cx1="http://schemas.microsoft.com/office/drawing/2015/9/8/chartex" xmlns:cx2="http://schemas.microsoft.com/office/drawing/2015/10/21/chartex" xmlns:cx3="http://schemas.microsoft.com/office/drawing/2016/5/9/chartex" xmlns:cx4="http://schemas.microsoft.com/office/drawing/2016/5/10/chartex" xmlns:cx5="http://schemas.microsoft.com/office/drawing/2016/5/11/chartex" xmlns:cx6="http://schemas.microsoft.com/office/drawing/2016/5/12/chartex" xmlns:cx7="http://schemas.microsoft.com/office/drawing/2016/5/13/chartex" xmlns:cx8="http://schemas.microsoft.com/office/drawing/2016/5/14/chartex" xmlns:mc="http://schemas.openxmlformats.org/markup-compatibility/2006" xmlns:aink="http://schemas.microsoft.com/office/drawing/2016/ink" xmlns:am3d="http://schemas.microsoft.com/office/drawing/2017/model3d" xmlns:o="urn:schemas-microsoft-com:office:office" xmlns:oel="http://schemas.microsoft.com/office/2019/extlst" xmlns:r="http://schemas.openxmlformats.org/officeDocument/2006/relationships" xmlns:m="http://schemas.openxmlformats.org/officeDocument/2006/math" xmlns:v="urn:schemas-microsoft-com:vml" xmlns:wp14="http://schemas.microsoft.com/office/word/2010/wordprocessingDrawing" xmlns:wp="http://schemas.openxmlformats.org/drawingml/2006/wordprocessingDrawing" xmlns:w10="urn:schemas-microsoft-com:office:word" xmlns:w="http://schemas.openxmlformats.org/wordprocessingml/2006/main" xmlns:w14="http://schemas.microsoft.com/office/word/2010/wordml" xmlns:w15="http://schemas.microsoft.com/office/word/2012/wordml" xmlns:w16cex="http://schemas.microsoft.com/office/word/2018/wordml/cex" xmlns:w16cid="http://schemas.microsoft.com/office/word/2016/wordml/cid" xmlns:w16="http://schemas.microsoft.com/office/word/2018/wordml" xmlns:w16du="http://schemas.microsoft.com/office/word/2023/wordml/word16du" xmlns:w16sdtdh="http://schemas.microsoft.com/office/word/2020/wordml/sdtdatahash" xmlns:w16sdtfl="http://schemas.microsoft.com/office/word/2024/wordml/sdtformatlock" xmlns:w16se="http://schemas.microsoft.com/office/word/2015/wordml/symex" xmlns:wpg="http://schemas.microsoft.com/office/word/2010/wordprocessingGroup" xmlns:wpi="http://schemas.microsoft.com/office/word/2010/wordprocessingInk" xmlns:wne="http://schemas.microsoft.com/office/word/2006/wordml" xmlns:wps="http://schemas.microsoft.com/office/word/2010/wordprocessingShape" mc:Ignorable="w14 w15 w16se w16cid w16 w16cex w16sdtdh w16sdtfl w16du wp14">
   <w:abstractNum w:abstractNumId="0" w15:restartNumberingAfterBreak="0">
+    <w:nsid w:val="091E7E1C"/>
+    <w:multiLevelType w:val="multilevel"/>
+    <w:tmpl w:val="7C32FD30"/>
+    <w:lvl w:ilvl="0">
+      <w:start w:val="1"/>
+      <w:numFmt w:val="bullet"/>
+      <w:lvlText w:val=""/>
+      <w:lvlJc w:val="left"/>
+      <w:pPr>
+        <w:tabs>
+          <w:tab w:val="num" w:pos="720"/>
+        </w:tabs>
+        <w:ind w:left="720" w:hanging="360"/>
+      </w:pPr>
+      <w:rPr>
+        <w:rFonts w:ascii="Symbol" w:hAnsi="Symbol" w:hint="default"/>
+        <w:sz w:val="20"/>
+      </w:rPr>
+    </w:lvl>
+    <w:lvl w:ilvl="1" w:tentative="1">
+      <w:start w:val="1"/>
+      <w:numFmt w:val="bullet"/>
+      <w:lvlText w:val="o"/>
+      <w:lvlJc w:val="left"/>
+      <w:pPr>
+        <w:tabs>
+          <w:tab w:val="num" w:pos="1440"/>
+        </w:tabs>
+        <w:ind w:left="1440" w:hanging="360"/>
+      </w:pPr>
+      <w:rPr>
+        <w:rFonts w:ascii="Courier New" w:hAnsi="Courier New" w:hint="default"/>
+        <w:sz w:val="20"/>
+      </w:rPr>
+    </w:lvl>
+    <w:lvl w:ilvl="2" w:tentative="1">
+      <w:start w:val="1"/>
+      <w:numFmt w:val="bullet"/>
+      <w:lvlText w:val=""/>
+      <w:lvlJc w:val="left"/>
+      <w:pPr>
+        <w:tabs>
+          <w:tab w:val="num" w:pos="2160"/>
+        </w:tabs>
+        <w:ind w:left="2160" w:hanging="360"/>
+      </w:pPr>
+      <w:rPr>
+        <w:rFonts w:ascii="Wingdings" w:hAnsi="Wingdings" w:hint="default"/>
+        <w:sz w:val="20"/>
+      </w:rPr>
+    </w:lvl>
+    <w:lvl w:ilvl="3" w:tentative="1">
+      <w:start w:val="1"/>
+      <w:numFmt w:val="bullet"/>
+      <w:lvlText w:val=""/>
+      <w:lvlJc w:val="left"/>
+      <w:pPr>
+        <w:tabs>
+          <w:tab w:val="num" w:pos="2880"/>
+        </w:tabs>
+        <w:ind w:left="2880" w:hanging="360"/>
+      </w:pPr>
+      <w:rPr>
+        <w:rFonts w:ascii="Wingdings" w:hAnsi="Wingdings" w:hint="default"/>
+        <w:sz w:val="20"/>
+      </w:rPr>
+    </w:lvl>
+    <w:lvl w:ilvl="4" w:tentative="1">
+      <w:start w:val="1"/>
+      <w:numFmt w:val="bullet"/>
+      <w:lvlText w:val=""/>
+      <w:lvlJc w:val="left"/>
+      <w:pPr>
+        <w:tabs>
+          <w:tab w:val="num" w:pos="3600"/>
+        </w:tabs>
+        <w:ind w:left="3600" w:hanging="360"/>
+      </w:pPr>
+      <w:rPr>
+        <w:rFonts w:ascii="Wingdings" w:hAnsi="Wingdings" w:hint="default"/>
+        <w:sz w:val="20"/>
+      </w:rPr>
+    </w:lvl>
+    <w:lvl w:ilvl="5" w:tentative="1">
+      <w:start w:val="1"/>
+      <w:numFmt w:val="bullet"/>
+      <w:lvlText w:val=""/>
+      <w:lvlJc w:val="left"/>
+      <w:pPr>
+        <w:tabs>
+          <w:tab w:val="num" w:pos="4320"/>
+        </w:tabs>
+        <w:ind w:left="4320" w:hanging="360"/>
+      </w:pPr>
+      <w:rPr>
+        <w:rFonts w:ascii="Wingdings" w:hAnsi="Wingdings" w:hint="default"/>
+        <w:sz w:val="20"/>
+      </w:rPr>
+    </w:lvl>
+    <w:lvl w:ilvl="6" w:tentative="1">
+      <w:start w:val="1"/>
+      <w:numFmt w:val="bullet"/>
+      <w:lvlText w:val=""/>
+      <w:lvlJc w:val="left"/>
+      <w:pPr>
+        <w:tabs>
+          <w:tab w:val="num" w:pos="5040"/>
+        </w:tabs>
+        <w:ind w:left="5040" w:hanging="360"/>
+      </w:pPr>
+      <w:rPr>
+        <w:rFonts w:ascii="Wingdings" w:hAnsi="Wingdings" w:hint="default"/>
+        <w:sz w:val="20"/>
+      </w:rPr>
+    </w:lvl>
+    <w:lvl w:ilvl="7" w:tentative="1">
+      <w:start w:val="1"/>
+      <w:numFmt w:val="bullet"/>
+      <w:lvlText w:val=""/>
+      <w:lvlJc w:val="left"/>
+      <w:pPr>
+        <w:tabs>
+          <w:tab w:val="num" w:pos="5760"/>
+        </w:tabs>
+        <w:ind w:left="5760" w:hanging="360"/>
+      </w:pPr>
+      <w:rPr>
+        <w:rFonts w:ascii="Wingdings" w:hAnsi="Wingdings" w:hint="default"/>
+        <w:sz w:val="20"/>
+      </w:rPr>
+    </w:lvl>
+    <w:lvl w:ilvl="8" w:tentative="1">
+      <w:start w:val="1"/>
+      <w:numFmt w:val="bullet"/>
+      <w:lvlText w:val=""/>
+      <w:lvlJc w:val="left"/>
+      <w:pPr>
+        <w:tabs>
+          <w:tab w:val="num" w:pos="6480"/>
+        </w:tabs>
+        <w:ind w:left="6480" w:hanging="360"/>
+      </w:pPr>
+      <w:rPr>
+        <w:rFonts w:ascii="Wingdings" w:hAnsi="Wingdings" w:hint="default"/>
+        <w:sz w:val="20"/>
+      </w:rPr>
+    </w:lvl>
+  </w:abstractNum>
+  <w:abstractNum w:abstractNumId="1" w15:restartNumberingAfterBreak="0">
+    <w:nsid w:val="182E4EDF"/>
+    <w:multiLevelType w:val="multilevel"/>
+    <w:tmpl w:val="0B76F722"/>
+    <w:lvl w:ilvl="0">
+      <w:start w:val="1"/>
+      <w:numFmt w:val="bullet"/>
+      <w:lvlText w:val=""/>
+      <w:lvlJc w:val="left"/>
+      <w:pPr>
+        <w:tabs>
+          <w:tab w:val="num" w:pos="720"/>
+        </w:tabs>
+        <w:ind w:left="720" w:hanging="360"/>
+      </w:pPr>
+      <w:rPr>
+        <w:rFonts w:ascii="Symbol" w:hAnsi="Symbol" w:hint="default"/>
+        <w:sz w:val="20"/>
+      </w:rPr>
+    </w:lvl>
+    <w:lvl w:ilvl="1" w:tentative="1">
+      <w:start w:val="1"/>
+      <w:numFmt w:val="bullet"/>
+      <w:lvlText w:val="o"/>
+      <w:lvlJc w:val="left"/>
+      <w:pPr>
+        <w:tabs>
+          <w:tab w:val="num" w:pos="1440"/>
+        </w:tabs>
+        <w:ind w:left="1440" w:hanging="360"/>
+      </w:pPr>
+      <w:rPr>
+        <w:rFonts w:ascii="Courier New" w:hAnsi="Courier New" w:hint="default"/>
+        <w:sz w:val="20"/>
+      </w:rPr>
+    </w:lvl>
+    <w:lvl w:ilvl="2" w:tentative="1">
+      <w:start w:val="1"/>
+      <w:numFmt w:val="bullet"/>
+      <w:lvlText w:val=""/>
+      <w:lvlJc w:val="left"/>
+      <w:pPr>
+        <w:tabs>
+          <w:tab w:val="num" w:pos="2160"/>
+        </w:tabs>
+        <w:ind w:left="2160" w:hanging="360"/>
+      </w:pPr>
+      <w:rPr>
+        <w:rFonts w:ascii="Wingdings" w:hAnsi="Wingdings" w:hint="default"/>
+        <w:sz w:val="20"/>
+      </w:rPr>
+    </w:lvl>
+    <w:lvl w:ilvl="3" w:tentative="1">
+      <w:start w:val="1"/>
+      <w:numFmt w:val="bullet"/>
+      <w:lvlText w:val=""/>
+      <w:lvlJc w:val="left"/>
+      <w:pPr>
+        <w:tabs>
+          <w:tab w:val="num" w:pos="2880"/>
+        </w:tabs>
+        <w:ind w:left="2880" w:hanging="360"/>
+      </w:pPr>
+      <w:rPr>
+        <w:rFonts w:ascii="Wingdings" w:hAnsi="Wingdings" w:hint="default"/>
+        <w:sz w:val="20"/>
+      </w:rPr>
+    </w:lvl>
+    <w:lvl w:ilvl="4" w:tentative="1">
+      <w:start w:val="1"/>
+      <w:numFmt w:val="bullet"/>
+      <w:lvlText w:val=""/>
+      <w:lvlJc w:val="left"/>
+      <w:pPr>
+        <w:tabs>
+          <w:tab w:val="num" w:pos="3600"/>
+        </w:tabs>
+        <w:ind w:left="3600" w:hanging="360"/>
+      </w:pPr>
+      <w:rPr>
+        <w:rFonts w:ascii="Wingdings" w:hAnsi="Wingdings" w:hint="default"/>
+        <w:sz w:val="20"/>
+      </w:rPr>
+    </w:lvl>
+    <w:lvl w:ilvl="5" w:tentative="1">
+      <w:start w:val="1"/>
+      <w:numFmt w:val="bullet"/>
+      <w:lvlText w:val=""/>
+      <w:lvlJc w:val="left"/>
+      <w:pPr>
+        <w:tabs>
+          <w:tab w:val="num" w:pos="4320"/>
+        </w:tabs>
+        <w:ind w:left="4320" w:hanging="360"/>
+      </w:pPr>
+      <w:rPr>
+        <w:rFonts w:ascii="Wingdings" w:hAnsi="Wingdings" w:hint="default"/>
+        <w:sz w:val="20"/>
+      </w:rPr>
+    </w:lvl>
+    <w:lvl w:ilvl="6" w:tentative="1">
+      <w:start w:val="1"/>
+      <w:numFmt w:val="bullet"/>
+      <w:lvlText w:val=""/>
+      <w:lvlJc w:val="left"/>
+      <w:pPr>
+        <w:tabs>
+          <w:tab w:val="num" w:pos="5040"/>
+        </w:tabs>
+        <w:ind w:left="5040" w:hanging="360"/>
+      </w:pPr>
+      <w:rPr>
+        <w:rFonts w:ascii="Wingdings" w:hAnsi="Wingdings" w:hint="default"/>
+        <w:sz w:val="20"/>
+      </w:rPr>
+    </w:lvl>
+    <w:lvl w:ilvl="7" w:tentative="1">
+      <w:start w:val="1"/>
+      <w:numFmt w:val="bullet"/>
+      <w:lvlText w:val=""/>
+      <w:lvlJc w:val="left"/>
+      <w:pPr>
+        <w:tabs>
+          <w:tab w:val="num" w:pos="5760"/>
+        </w:tabs>
+        <w:ind w:left="5760" w:hanging="360"/>
+      </w:pPr>
+      <w:rPr>
+        <w:rFonts w:ascii="Wingdings" w:hAnsi="Wingdings" w:hint="default"/>
+        <w:sz w:val="20"/>
+      </w:rPr>
+    </w:lvl>
+    <w:lvl w:ilvl="8" w:tentative="1">
+      <w:start w:val="1"/>
+      <w:numFmt w:val="bullet"/>
+      <w:lvlText w:val=""/>
+      <w:lvlJc w:val="left"/>
+      <w:pPr>
+        <w:tabs>
+          <w:tab w:val="num" w:pos="6480"/>
+        </w:tabs>
+        <w:ind w:left="6480" w:hanging="360"/>
+      </w:pPr>
+      <w:rPr>
+        <w:rFonts w:ascii="Wingdings" w:hAnsi="Wingdings" w:hint="default"/>
+        <w:sz w:val="20"/>
+      </w:rPr>
+    </w:lvl>
+  </w:abstractNum>
+  <w:abstractNum w:abstractNumId="2" w15:restartNumberingAfterBreak="0">
     <w:nsid w:val="19A90BB3"/>
     <w:multiLevelType w:val="multilevel"/>
     <w:tmpl w:val="1776761A"/>
@@ -1907,7 +2578,752 @@
       </w:rPr>
     </w:lvl>
   </w:abstractNum>
-  <w:abstractNum w:abstractNumId="1" w15:restartNumberingAfterBreak="0">
+  <w:abstractNum w:abstractNumId="3" w15:restartNumberingAfterBreak="0">
+    <w:nsid w:val="21D93FDE"/>
+    <w:multiLevelType w:val="multilevel"/>
+    <w:tmpl w:val="C0F28770"/>
+    <w:lvl w:ilvl="0">
+      <w:start w:val="1"/>
+      <w:numFmt w:val="bullet"/>
+      <w:lvlText w:val=""/>
+      <w:lvlJc w:val="left"/>
+      <w:pPr>
+        <w:tabs>
+          <w:tab w:val="num" w:pos="720"/>
+        </w:tabs>
+        <w:ind w:left="720" w:hanging="360"/>
+      </w:pPr>
+      <w:rPr>
+        <w:rFonts w:ascii="Symbol" w:hAnsi="Symbol" w:hint="default"/>
+        <w:sz w:val="20"/>
+      </w:rPr>
+    </w:lvl>
+    <w:lvl w:ilvl="1" w:tentative="1">
+      <w:start w:val="1"/>
+      <w:numFmt w:val="bullet"/>
+      <w:lvlText w:val="o"/>
+      <w:lvlJc w:val="left"/>
+      <w:pPr>
+        <w:tabs>
+          <w:tab w:val="num" w:pos="1440"/>
+        </w:tabs>
+        <w:ind w:left="1440" w:hanging="360"/>
+      </w:pPr>
+      <w:rPr>
+        <w:rFonts w:ascii="Courier New" w:hAnsi="Courier New" w:hint="default"/>
+        <w:sz w:val="20"/>
+      </w:rPr>
+    </w:lvl>
+    <w:lvl w:ilvl="2" w:tentative="1">
+      <w:start w:val="1"/>
+      <w:numFmt w:val="bullet"/>
+      <w:lvlText w:val=""/>
+      <w:lvlJc w:val="left"/>
+      <w:pPr>
+        <w:tabs>
+          <w:tab w:val="num" w:pos="2160"/>
+        </w:tabs>
+        <w:ind w:left="2160" w:hanging="360"/>
+      </w:pPr>
+      <w:rPr>
+        <w:rFonts w:ascii="Wingdings" w:hAnsi="Wingdings" w:hint="default"/>
+        <w:sz w:val="20"/>
+      </w:rPr>
+    </w:lvl>
+    <w:lvl w:ilvl="3" w:tentative="1">
+      <w:start w:val="1"/>
+      <w:numFmt w:val="bullet"/>
+      <w:lvlText w:val=""/>
+      <w:lvlJc w:val="left"/>
+      <w:pPr>
+        <w:tabs>
+          <w:tab w:val="num" w:pos="2880"/>
+        </w:tabs>
+        <w:ind w:left="2880" w:hanging="360"/>
+      </w:pPr>
+      <w:rPr>
+        <w:rFonts w:ascii="Wingdings" w:hAnsi="Wingdings" w:hint="default"/>
+        <w:sz w:val="20"/>
+      </w:rPr>
+    </w:lvl>
+    <w:lvl w:ilvl="4" w:tentative="1">
+      <w:start w:val="1"/>
+      <w:numFmt w:val="bullet"/>
+      <w:lvlText w:val=""/>
+      <w:lvlJc w:val="left"/>
+      <w:pPr>
+        <w:tabs>
+          <w:tab w:val="num" w:pos="3600"/>
+        </w:tabs>
+        <w:ind w:left="3600" w:hanging="360"/>
+      </w:pPr>
+      <w:rPr>
+        <w:rFonts w:ascii="Wingdings" w:hAnsi="Wingdings" w:hint="default"/>
+        <w:sz w:val="20"/>
+      </w:rPr>
+    </w:lvl>
+    <w:lvl w:ilvl="5" w:tentative="1">
+      <w:start w:val="1"/>
+      <w:numFmt w:val="bullet"/>
+      <w:lvlText w:val=""/>
+      <w:lvlJc w:val="left"/>
+      <w:pPr>
+        <w:tabs>
+          <w:tab w:val="num" w:pos="4320"/>
+        </w:tabs>
+        <w:ind w:left="4320" w:hanging="360"/>
+      </w:pPr>
+      <w:rPr>
+        <w:rFonts w:ascii="Wingdings" w:hAnsi="Wingdings" w:hint="default"/>
+        <w:sz w:val="20"/>
+      </w:rPr>
+    </w:lvl>
+    <w:lvl w:ilvl="6" w:tentative="1">
+      <w:start w:val="1"/>
+      <w:numFmt w:val="bullet"/>
+      <w:lvlText w:val=""/>
+      <w:lvlJc w:val="left"/>
+      <w:pPr>
+        <w:tabs>
+          <w:tab w:val="num" w:pos="5040"/>
+        </w:tabs>
+        <w:ind w:left="5040" w:hanging="360"/>
+      </w:pPr>
+      <w:rPr>
+        <w:rFonts w:ascii="Wingdings" w:hAnsi="Wingdings" w:hint="default"/>
+        <w:sz w:val="20"/>
+      </w:rPr>
+    </w:lvl>
+    <w:lvl w:ilvl="7" w:tentative="1">
+      <w:start w:val="1"/>
+      <w:numFmt w:val="bullet"/>
+      <w:lvlText w:val=""/>
+      <w:lvlJc w:val="left"/>
+      <w:pPr>
+        <w:tabs>
+          <w:tab w:val="num" w:pos="5760"/>
+        </w:tabs>
+        <w:ind w:left="5760" w:hanging="360"/>
+      </w:pPr>
+      <w:rPr>
+        <w:rFonts w:ascii="Wingdings" w:hAnsi="Wingdings" w:hint="default"/>
+        <w:sz w:val="20"/>
+      </w:rPr>
+    </w:lvl>
+    <w:lvl w:ilvl="8" w:tentative="1">
+      <w:start w:val="1"/>
+      <w:numFmt w:val="bullet"/>
+      <w:lvlText w:val=""/>
+      <w:lvlJc w:val="left"/>
+      <w:pPr>
+        <w:tabs>
+          <w:tab w:val="num" w:pos="6480"/>
+        </w:tabs>
+        <w:ind w:left="6480" w:hanging="360"/>
+      </w:pPr>
+      <w:rPr>
+        <w:rFonts w:ascii="Wingdings" w:hAnsi="Wingdings" w:hint="default"/>
+        <w:sz w:val="20"/>
+      </w:rPr>
+    </w:lvl>
+  </w:abstractNum>
+  <w:abstractNum w:abstractNumId="4" w15:restartNumberingAfterBreak="0">
+    <w:nsid w:val="2D542C35"/>
+    <w:multiLevelType w:val="multilevel"/>
+    <w:tmpl w:val="739A6686"/>
+    <w:lvl w:ilvl="0">
+      <w:start w:val="1"/>
+      <w:numFmt w:val="bullet"/>
+      <w:lvlText w:val=""/>
+      <w:lvlJc w:val="left"/>
+      <w:pPr>
+        <w:tabs>
+          <w:tab w:val="num" w:pos="720"/>
+        </w:tabs>
+        <w:ind w:left="720" w:hanging="360"/>
+      </w:pPr>
+      <w:rPr>
+        <w:rFonts w:ascii="Symbol" w:hAnsi="Symbol" w:hint="default"/>
+        <w:sz w:val="20"/>
+      </w:rPr>
+    </w:lvl>
+    <w:lvl w:ilvl="1" w:tentative="1">
+      <w:start w:val="1"/>
+      <w:numFmt w:val="bullet"/>
+      <w:lvlText w:val="o"/>
+      <w:lvlJc w:val="left"/>
+      <w:pPr>
+        <w:tabs>
+          <w:tab w:val="num" w:pos="1440"/>
+        </w:tabs>
+        <w:ind w:left="1440" w:hanging="360"/>
+      </w:pPr>
+      <w:rPr>
+        <w:rFonts w:ascii="Courier New" w:hAnsi="Courier New" w:hint="default"/>
+        <w:sz w:val="20"/>
+      </w:rPr>
+    </w:lvl>
+    <w:lvl w:ilvl="2" w:tentative="1">
+      <w:start w:val="1"/>
+      <w:numFmt w:val="bullet"/>
+      <w:lvlText w:val=""/>
+      <w:lvlJc w:val="left"/>
+      <w:pPr>
+        <w:tabs>
+          <w:tab w:val="num" w:pos="2160"/>
+        </w:tabs>
+        <w:ind w:left="2160" w:hanging="360"/>
+      </w:pPr>
+      <w:rPr>
+        <w:rFonts w:ascii="Wingdings" w:hAnsi="Wingdings" w:hint="default"/>
+        <w:sz w:val="20"/>
+      </w:rPr>
+    </w:lvl>
+    <w:lvl w:ilvl="3" w:tentative="1">
+      <w:start w:val="1"/>
+      <w:numFmt w:val="bullet"/>
+      <w:lvlText w:val=""/>
+      <w:lvlJc w:val="left"/>
+      <w:pPr>
+        <w:tabs>
+          <w:tab w:val="num" w:pos="2880"/>
+        </w:tabs>
+        <w:ind w:left="2880" w:hanging="360"/>
+      </w:pPr>
+      <w:rPr>
+        <w:rFonts w:ascii="Wingdings" w:hAnsi="Wingdings" w:hint="default"/>
+        <w:sz w:val="20"/>
+      </w:rPr>
+    </w:lvl>
+    <w:lvl w:ilvl="4" w:tentative="1">
+      <w:start w:val="1"/>
+      <w:numFmt w:val="bullet"/>
+      <w:lvlText w:val=""/>
+      <w:lvlJc w:val="left"/>
+      <w:pPr>
+        <w:tabs>
+          <w:tab w:val="num" w:pos="3600"/>
+        </w:tabs>
+        <w:ind w:left="3600" w:hanging="360"/>
+      </w:pPr>
+      <w:rPr>
+        <w:rFonts w:ascii="Wingdings" w:hAnsi="Wingdings" w:hint="default"/>
+        <w:sz w:val="20"/>
+      </w:rPr>
+    </w:lvl>
+    <w:lvl w:ilvl="5" w:tentative="1">
+      <w:start w:val="1"/>
+      <w:numFmt w:val="bullet"/>
+      <w:lvlText w:val=""/>
+      <w:lvlJc w:val="left"/>
+      <w:pPr>
+        <w:tabs>
+          <w:tab w:val="num" w:pos="4320"/>
+        </w:tabs>
+        <w:ind w:left="4320" w:hanging="360"/>
+      </w:pPr>
+      <w:rPr>
+        <w:rFonts w:ascii="Wingdings" w:hAnsi="Wingdings" w:hint="default"/>
+        <w:sz w:val="20"/>
+      </w:rPr>
+    </w:lvl>
+    <w:lvl w:ilvl="6" w:tentative="1">
+      <w:start w:val="1"/>
+      <w:numFmt w:val="bullet"/>
+      <w:lvlText w:val=""/>
+      <w:lvlJc w:val="left"/>
+      <w:pPr>
+        <w:tabs>
+          <w:tab w:val="num" w:pos="5040"/>
+        </w:tabs>
+        <w:ind w:left="5040" w:hanging="360"/>
+      </w:pPr>
+      <w:rPr>
+        <w:rFonts w:ascii="Wingdings" w:hAnsi="Wingdings" w:hint="default"/>
+        <w:sz w:val="20"/>
+      </w:rPr>
+    </w:lvl>
+    <w:lvl w:ilvl="7" w:tentative="1">
+      <w:start w:val="1"/>
+      <w:numFmt w:val="bullet"/>
+      <w:lvlText w:val=""/>
+      <w:lvlJc w:val="left"/>
+      <w:pPr>
+        <w:tabs>
+          <w:tab w:val="num" w:pos="5760"/>
+        </w:tabs>
+        <w:ind w:left="5760" w:hanging="360"/>
+      </w:pPr>
+      <w:rPr>
+        <w:rFonts w:ascii="Wingdings" w:hAnsi="Wingdings" w:hint="default"/>
+        <w:sz w:val="20"/>
+      </w:rPr>
+    </w:lvl>
+    <w:lvl w:ilvl="8" w:tentative="1">
+      <w:start w:val="1"/>
+      <w:numFmt w:val="bullet"/>
+      <w:lvlText w:val=""/>
+      <w:lvlJc w:val="left"/>
+      <w:pPr>
+        <w:tabs>
+          <w:tab w:val="num" w:pos="6480"/>
+        </w:tabs>
+        <w:ind w:left="6480" w:hanging="360"/>
+      </w:pPr>
+      <w:rPr>
+        <w:rFonts w:ascii="Wingdings" w:hAnsi="Wingdings" w:hint="default"/>
+        <w:sz w:val="20"/>
+      </w:rPr>
+    </w:lvl>
+  </w:abstractNum>
+  <w:abstractNum w:abstractNumId="5" w15:restartNumberingAfterBreak="0">
+    <w:nsid w:val="3FC05711"/>
+    <w:multiLevelType w:val="multilevel"/>
+    <w:tmpl w:val="BE9AABC8"/>
+    <w:lvl w:ilvl="0">
+      <w:start w:val="1"/>
+      <w:numFmt w:val="bullet"/>
+      <w:lvlText w:val=""/>
+      <w:lvlJc w:val="left"/>
+      <w:pPr>
+        <w:tabs>
+          <w:tab w:val="num" w:pos="720"/>
+        </w:tabs>
+        <w:ind w:left="720" w:hanging="360"/>
+      </w:pPr>
+      <w:rPr>
+        <w:rFonts w:ascii="Symbol" w:hAnsi="Symbol" w:hint="default"/>
+        <w:sz w:val="20"/>
+      </w:rPr>
+    </w:lvl>
+    <w:lvl w:ilvl="1" w:tentative="1">
+      <w:start w:val="1"/>
+      <w:numFmt w:val="bullet"/>
+      <w:lvlText w:val="o"/>
+      <w:lvlJc w:val="left"/>
+      <w:pPr>
+        <w:tabs>
+          <w:tab w:val="num" w:pos="1440"/>
+        </w:tabs>
+        <w:ind w:left="1440" w:hanging="360"/>
+      </w:pPr>
+      <w:rPr>
+        <w:rFonts w:ascii="Courier New" w:hAnsi="Courier New" w:hint="default"/>
+        <w:sz w:val="20"/>
+      </w:rPr>
+    </w:lvl>
+    <w:lvl w:ilvl="2" w:tentative="1">
+      <w:start w:val="1"/>
+      <w:numFmt w:val="bullet"/>
+      <w:lvlText w:val=""/>
+      <w:lvlJc w:val="left"/>
+      <w:pPr>
+        <w:tabs>
+          <w:tab w:val="num" w:pos="2160"/>
+        </w:tabs>
+        <w:ind w:left="2160" w:hanging="360"/>
+      </w:pPr>
+      <w:rPr>
+        <w:rFonts w:ascii="Wingdings" w:hAnsi="Wingdings" w:hint="default"/>
+        <w:sz w:val="20"/>
+      </w:rPr>
+    </w:lvl>
+    <w:lvl w:ilvl="3" w:tentative="1">
+      <w:start w:val="1"/>
+      <w:numFmt w:val="bullet"/>
+      <w:lvlText w:val=""/>
+      <w:lvlJc w:val="left"/>
+      <w:pPr>
+        <w:tabs>
+          <w:tab w:val="num" w:pos="2880"/>
+        </w:tabs>
+        <w:ind w:left="2880" w:hanging="360"/>
+      </w:pPr>
+      <w:rPr>
+        <w:rFonts w:ascii="Wingdings" w:hAnsi="Wingdings" w:hint="default"/>
+        <w:sz w:val="20"/>
+      </w:rPr>
+    </w:lvl>
+    <w:lvl w:ilvl="4" w:tentative="1">
+      <w:start w:val="1"/>
+      <w:numFmt w:val="bullet"/>
+      <w:lvlText w:val=""/>
+      <w:lvlJc w:val="left"/>
+      <w:pPr>
+        <w:tabs>
+          <w:tab w:val="num" w:pos="3600"/>
+        </w:tabs>
+        <w:ind w:left="3600" w:hanging="360"/>
+      </w:pPr>
+      <w:rPr>
+        <w:rFonts w:ascii="Wingdings" w:hAnsi="Wingdings" w:hint="default"/>
+        <w:sz w:val="20"/>
+      </w:rPr>
+    </w:lvl>
+    <w:lvl w:ilvl="5" w:tentative="1">
+      <w:start w:val="1"/>
+      <w:numFmt w:val="bullet"/>
+      <w:lvlText w:val=""/>
+      <w:lvlJc w:val="left"/>
+      <w:pPr>
+        <w:tabs>
+          <w:tab w:val="num" w:pos="4320"/>
+        </w:tabs>
+        <w:ind w:left="4320" w:hanging="360"/>
+      </w:pPr>
+      <w:rPr>
+        <w:rFonts w:ascii="Wingdings" w:hAnsi="Wingdings" w:hint="default"/>
+        <w:sz w:val="20"/>
+      </w:rPr>
+    </w:lvl>
+    <w:lvl w:ilvl="6" w:tentative="1">
+      <w:start w:val="1"/>
+      <w:numFmt w:val="bullet"/>
+      <w:lvlText w:val=""/>
+      <w:lvlJc w:val="left"/>
+      <w:pPr>
+        <w:tabs>
+          <w:tab w:val="num" w:pos="5040"/>
+        </w:tabs>
+        <w:ind w:left="5040" w:hanging="360"/>
+      </w:pPr>
+      <w:rPr>
+        <w:rFonts w:ascii="Wingdings" w:hAnsi="Wingdings" w:hint="default"/>
+        <w:sz w:val="20"/>
+      </w:rPr>
+    </w:lvl>
+    <w:lvl w:ilvl="7" w:tentative="1">
+      <w:start w:val="1"/>
+      <w:numFmt w:val="bullet"/>
+      <w:lvlText w:val=""/>
+      <w:lvlJc w:val="left"/>
+      <w:pPr>
+        <w:tabs>
+          <w:tab w:val="num" w:pos="5760"/>
+        </w:tabs>
+        <w:ind w:left="5760" w:hanging="360"/>
+      </w:pPr>
+      <w:rPr>
+        <w:rFonts w:ascii="Wingdings" w:hAnsi="Wingdings" w:hint="default"/>
+        <w:sz w:val="20"/>
+      </w:rPr>
+    </w:lvl>
+    <w:lvl w:ilvl="8" w:tentative="1">
+      <w:start w:val="1"/>
+      <w:numFmt w:val="bullet"/>
+      <w:lvlText w:val=""/>
+      <w:lvlJc w:val="left"/>
+      <w:pPr>
+        <w:tabs>
+          <w:tab w:val="num" w:pos="6480"/>
+        </w:tabs>
+        <w:ind w:left="6480" w:hanging="360"/>
+      </w:pPr>
+      <w:rPr>
+        <w:rFonts w:ascii="Wingdings" w:hAnsi="Wingdings" w:hint="default"/>
+        <w:sz w:val="20"/>
+      </w:rPr>
+    </w:lvl>
+  </w:abstractNum>
+  <w:abstractNum w:abstractNumId="6" w15:restartNumberingAfterBreak="0">
+    <w:nsid w:val="48D85AC9"/>
+    <w:multiLevelType w:val="multilevel"/>
+    <w:tmpl w:val="4E56C4B2"/>
+    <w:lvl w:ilvl="0">
+      <w:start w:val="1"/>
+      <w:numFmt w:val="bullet"/>
+      <w:lvlText w:val=""/>
+      <w:lvlJc w:val="left"/>
+      <w:pPr>
+        <w:tabs>
+          <w:tab w:val="num" w:pos="720"/>
+        </w:tabs>
+        <w:ind w:left="720" w:hanging="360"/>
+      </w:pPr>
+      <w:rPr>
+        <w:rFonts w:ascii="Symbol" w:hAnsi="Symbol" w:hint="default"/>
+        <w:sz w:val="20"/>
+      </w:rPr>
+    </w:lvl>
+    <w:lvl w:ilvl="1" w:tentative="1">
+      <w:start w:val="1"/>
+      <w:numFmt w:val="bullet"/>
+      <w:lvlText w:val="o"/>
+      <w:lvlJc w:val="left"/>
+      <w:pPr>
+        <w:tabs>
+          <w:tab w:val="num" w:pos="1440"/>
+        </w:tabs>
+        <w:ind w:left="1440" w:hanging="360"/>
+      </w:pPr>
+      <w:rPr>
+        <w:rFonts w:ascii="Courier New" w:hAnsi="Courier New" w:hint="default"/>
+        <w:sz w:val="20"/>
+      </w:rPr>
+    </w:lvl>
+    <w:lvl w:ilvl="2" w:tentative="1">
+      <w:start w:val="1"/>
+      <w:numFmt w:val="bullet"/>
+      <w:lvlText w:val=""/>
+      <w:lvlJc w:val="left"/>
+      <w:pPr>
+        <w:tabs>
+          <w:tab w:val="num" w:pos="2160"/>
+        </w:tabs>
+        <w:ind w:left="2160" w:hanging="360"/>
+      </w:pPr>
+      <w:rPr>
+        <w:rFonts w:ascii="Wingdings" w:hAnsi="Wingdings" w:hint="default"/>
+        <w:sz w:val="20"/>
+      </w:rPr>
+    </w:lvl>
+    <w:lvl w:ilvl="3" w:tentative="1">
+      <w:start w:val="1"/>
+      <w:numFmt w:val="bullet"/>
+      <w:lvlText w:val=""/>
+      <w:lvlJc w:val="left"/>
+      <w:pPr>
+        <w:tabs>
+          <w:tab w:val="num" w:pos="2880"/>
+        </w:tabs>
+        <w:ind w:left="2880" w:hanging="360"/>
+      </w:pPr>
+      <w:rPr>
+        <w:rFonts w:ascii="Wingdings" w:hAnsi="Wingdings" w:hint="default"/>
+        <w:sz w:val="20"/>
+      </w:rPr>
+    </w:lvl>
+    <w:lvl w:ilvl="4" w:tentative="1">
+      <w:start w:val="1"/>
+      <w:numFmt w:val="bullet"/>
+      <w:lvlText w:val=""/>
+      <w:lvlJc w:val="left"/>
+      <w:pPr>
+        <w:tabs>
+          <w:tab w:val="num" w:pos="3600"/>
+        </w:tabs>
+        <w:ind w:left="3600" w:hanging="360"/>
+      </w:pPr>
+      <w:rPr>
+        <w:rFonts w:ascii="Wingdings" w:hAnsi="Wingdings" w:hint="default"/>
+        <w:sz w:val="20"/>
+      </w:rPr>
+    </w:lvl>
+    <w:lvl w:ilvl="5" w:tentative="1">
+      <w:start w:val="1"/>
+      <w:numFmt w:val="bullet"/>
+      <w:lvlText w:val=""/>
+      <w:lvlJc w:val="left"/>
+      <w:pPr>
+        <w:tabs>
+          <w:tab w:val="num" w:pos="4320"/>
+        </w:tabs>
+        <w:ind w:left="4320" w:hanging="360"/>
+      </w:pPr>
+      <w:rPr>
+        <w:rFonts w:ascii="Wingdings" w:hAnsi="Wingdings" w:hint="default"/>
+        <w:sz w:val="20"/>
+      </w:rPr>
+    </w:lvl>
+    <w:lvl w:ilvl="6" w:tentative="1">
+      <w:start w:val="1"/>
+      <w:numFmt w:val="bullet"/>
+      <w:lvlText w:val=""/>
+      <w:lvlJc w:val="left"/>
+      <w:pPr>
+        <w:tabs>
+          <w:tab w:val="num" w:pos="5040"/>
+        </w:tabs>
+        <w:ind w:left="5040" w:hanging="360"/>
+      </w:pPr>
+      <w:rPr>
+        <w:rFonts w:ascii="Wingdings" w:hAnsi="Wingdings" w:hint="default"/>
+        <w:sz w:val="20"/>
+      </w:rPr>
+    </w:lvl>
+    <w:lvl w:ilvl="7" w:tentative="1">
+      <w:start w:val="1"/>
+      <w:numFmt w:val="bullet"/>
+      <w:lvlText w:val=""/>
+      <w:lvlJc w:val="left"/>
+      <w:pPr>
+        <w:tabs>
+          <w:tab w:val="num" w:pos="5760"/>
+        </w:tabs>
+        <w:ind w:left="5760" w:hanging="360"/>
+      </w:pPr>
+      <w:rPr>
+        <w:rFonts w:ascii="Wingdings" w:hAnsi="Wingdings" w:hint="default"/>
+        <w:sz w:val="20"/>
+      </w:rPr>
+    </w:lvl>
+    <w:lvl w:ilvl="8" w:tentative="1">
+      <w:start w:val="1"/>
+      <w:numFmt w:val="bullet"/>
+      <w:lvlText w:val=""/>
+      <w:lvlJc w:val="left"/>
+      <w:pPr>
+        <w:tabs>
+          <w:tab w:val="num" w:pos="6480"/>
+        </w:tabs>
+        <w:ind w:left="6480" w:hanging="360"/>
+      </w:pPr>
+      <w:rPr>
+        <w:rFonts w:ascii="Wingdings" w:hAnsi="Wingdings" w:hint="default"/>
+        <w:sz w:val="20"/>
+      </w:rPr>
+    </w:lvl>
+  </w:abstractNum>
+  <w:abstractNum w:abstractNumId="7" w15:restartNumberingAfterBreak="0">
+    <w:nsid w:val="4F1760DC"/>
+    <w:multiLevelType w:val="multilevel"/>
+    <w:tmpl w:val="3320B37E"/>
+    <w:lvl w:ilvl="0">
+      <w:start w:val="1"/>
+      <w:numFmt w:val="bullet"/>
+      <w:lvlText w:val=""/>
+      <w:lvlJc w:val="left"/>
+      <w:pPr>
+        <w:tabs>
+          <w:tab w:val="num" w:pos="720"/>
+        </w:tabs>
+        <w:ind w:left="720" w:hanging="360"/>
+      </w:pPr>
+      <w:rPr>
+        <w:rFonts w:ascii="Symbol" w:hAnsi="Symbol" w:hint="default"/>
+        <w:sz w:val="20"/>
+      </w:rPr>
+    </w:lvl>
+    <w:lvl w:ilvl="1" w:tentative="1">
+      <w:start w:val="1"/>
+      <w:numFmt w:val="bullet"/>
+      <w:lvlText w:val="o"/>
+      <w:lvlJc w:val="left"/>
+      <w:pPr>
+        <w:tabs>
+          <w:tab w:val="num" w:pos="1440"/>
+        </w:tabs>
+        <w:ind w:left="1440" w:hanging="360"/>
+      </w:pPr>
+      <w:rPr>
+        <w:rFonts w:ascii="Courier New" w:hAnsi="Courier New" w:hint="default"/>
+        <w:sz w:val="20"/>
+      </w:rPr>
+    </w:lvl>
+    <w:lvl w:ilvl="2" w:tentative="1">
+      <w:start w:val="1"/>
+      <w:numFmt w:val="bullet"/>
+      <w:lvlText w:val=""/>
+      <w:lvlJc w:val="left"/>
+      <w:pPr>
+        <w:tabs>
+          <w:tab w:val="num" w:pos="2160"/>
+        </w:tabs>
+        <w:ind w:left="2160" w:hanging="360"/>
+      </w:pPr>
+      <w:rPr>
+        <w:rFonts w:ascii="Wingdings" w:hAnsi="Wingdings" w:hint="default"/>
+        <w:sz w:val="20"/>
+      </w:rPr>
+    </w:lvl>
+    <w:lvl w:ilvl="3" w:tentative="1">
+      <w:start w:val="1"/>
+      <w:numFmt w:val="bullet"/>
+      <w:lvlText w:val=""/>
+      <w:lvlJc w:val="left"/>
+      <w:pPr>
+        <w:tabs>
+          <w:tab w:val="num" w:pos="2880"/>
+        </w:tabs>
+        <w:ind w:left="2880" w:hanging="360"/>
+      </w:pPr>
+      <w:rPr>
+        <w:rFonts w:ascii="Wingdings" w:hAnsi="Wingdings" w:hint="default"/>
+        <w:sz w:val="20"/>
+      </w:rPr>
+    </w:lvl>
+    <w:lvl w:ilvl="4" w:tentative="1">
+      <w:start w:val="1"/>
+      <w:numFmt w:val="bullet"/>
+      <w:lvlText w:val=""/>
+      <w:lvlJc w:val="left"/>
+      <w:pPr>
+        <w:tabs>
+          <w:tab w:val="num" w:pos="3600"/>
+        </w:tabs>
+        <w:ind w:left="3600" w:hanging="360"/>
+      </w:pPr>
+      <w:rPr>
+        <w:rFonts w:ascii="Wingdings" w:hAnsi="Wingdings" w:hint="default"/>
+        <w:sz w:val="20"/>
+      </w:rPr>
+    </w:lvl>
+    <w:lvl w:ilvl="5" w:tentative="1">
+      <w:start w:val="1"/>
+      <w:numFmt w:val="bullet"/>
+      <w:lvlText w:val=""/>
+      <w:lvlJc w:val="left"/>
+      <w:pPr>
+        <w:tabs>
+          <w:tab w:val="num" w:pos="4320"/>
+        </w:tabs>
+        <w:ind w:left="4320" w:hanging="360"/>
+      </w:pPr>
+      <w:rPr>
+        <w:rFonts w:ascii="Wingdings" w:hAnsi="Wingdings" w:hint="default"/>
+        <w:sz w:val="20"/>
+      </w:rPr>
+    </w:lvl>
+    <w:lvl w:ilvl="6" w:tentative="1">
+      <w:start w:val="1"/>
+      <w:numFmt w:val="bullet"/>
+      <w:lvlText w:val=""/>
+      <w:lvlJc w:val="left"/>
+      <w:pPr>
+        <w:tabs>
+          <w:tab w:val="num" w:pos="5040"/>
+        </w:tabs>
+        <w:ind w:left="5040" w:hanging="360"/>
+      </w:pPr>
+      <w:rPr>
+        <w:rFonts w:ascii="Wingdings" w:hAnsi="Wingdings" w:hint="default"/>
+        <w:sz w:val="20"/>
+      </w:rPr>
+    </w:lvl>
+    <w:lvl w:ilvl="7" w:tentative="1">
+      <w:start w:val="1"/>
+      <w:numFmt w:val="bullet"/>
+      <w:lvlText w:val=""/>
+      <w:lvlJc w:val="left"/>
+      <w:pPr>
+        <w:tabs>
+          <w:tab w:val="num" w:pos="5760"/>
+        </w:tabs>
+        <w:ind w:left="5760" w:hanging="360"/>
+      </w:pPr>
+      <w:rPr>
+        <w:rFonts w:ascii="Wingdings" w:hAnsi="Wingdings" w:hint="default"/>
+        <w:sz w:val="20"/>
+      </w:rPr>
+    </w:lvl>
+    <w:lvl w:ilvl="8" w:tentative="1">
+      <w:start w:val="1"/>
+      <w:numFmt w:val="bullet"/>
+      <w:lvlText w:val=""/>
+      <w:lvlJc w:val="left"/>
+      <w:pPr>
+        <w:tabs>
+          <w:tab w:val="num" w:pos="6480"/>
+        </w:tabs>
+        <w:ind w:left="6480" w:hanging="360"/>
+      </w:pPr>
+      <w:rPr>
+        <w:rFonts w:ascii="Wingdings" w:hAnsi="Wingdings" w:hint="default"/>
+        <w:sz w:val="20"/>
+      </w:rPr>
+    </w:lvl>
+  </w:abstractNum>
+  <w:abstractNum w:abstractNumId="8" w15:restartNumberingAfterBreak="0">
     <w:nsid w:val="53D963FE"/>
     <w:multiLevelType w:val="multilevel"/>
     <w:tmpl w:val="B47810D8"/>
@@ -2056,7 +3472,7 @@
       </w:rPr>
     </w:lvl>
   </w:abstractNum>
-  <w:abstractNum w:abstractNumId="2" w15:restartNumberingAfterBreak="0">
+  <w:abstractNum w:abstractNumId="9" w15:restartNumberingAfterBreak="0">
     <w:nsid w:val="557528DB"/>
     <w:multiLevelType w:val="multilevel"/>
     <w:tmpl w:val="3DAA1EF4"/>
@@ -2205,7 +3621,156 @@
       </w:rPr>
     </w:lvl>
   </w:abstractNum>
-  <w:abstractNum w:abstractNumId="3" w15:restartNumberingAfterBreak="0">
+  <w:abstractNum w:abstractNumId="10" w15:restartNumberingAfterBreak="0">
+    <w:nsid w:val="562E67EF"/>
+    <w:multiLevelType w:val="multilevel"/>
+    <w:tmpl w:val="125CB9C8"/>
+    <w:lvl w:ilvl="0">
+      <w:start w:val="1"/>
+      <w:numFmt w:val="bullet"/>
+      <w:lvlText w:val=""/>
+      <w:lvlJc w:val="left"/>
+      <w:pPr>
+        <w:tabs>
+          <w:tab w:val="num" w:pos="720"/>
+        </w:tabs>
+        <w:ind w:left="720" w:hanging="360"/>
+      </w:pPr>
+      <w:rPr>
+        <w:rFonts w:ascii="Symbol" w:hAnsi="Symbol" w:hint="default"/>
+        <w:sz w:val="20"/>
+      </w:rPr>
+    </w:lvl>
+    <w:lvl w:ilvl="1" w:tentative="1">
+      <w:start w:val="1"/>
+      <w:numFmt w:val="bullet"/>
+      <w:lvlText w:val="o"/>
+      <w:lvlJc w:val="left"/>
+      <w:pPr>
+        <w:tabs>
+          <w:tab w:val="num" w:pos="1440"/>
+        </w:tabs>
+        <w:ind w:left="1440" w:hanging="360"/>
+      </w:pPr>
+      <w:rPr>
+        <w:rFonts w:ascii="Courier New" w:hAnsi="Courier New" w:hint="default"/>
+        <w:sz w:val="20"/>
+      </w:rPr>
+    </w:lvl>
+    <w:lvl w:ilvl="2" w:tentative="1">
+      <w:start w:val="1"/>
+      <w:numFmt w:val="bullet"/>
+      <w:lvlText w:val=""/>
+      <w:lvlJc w:val="left"/>
+      <w:pPr>
+        <w:tabs>
+          <w:tab w:val="num" w:pos="2160"/>
+        </w:tabs>
+        <w:ind w:left="2160" w:hanging="360"/>
+      </w:pPr>
+      <w:rPr>
+        <w:rFonts w:ascii="Wingdings" w:hAnsi="Wingdings" w:hint="default"/>
+        <w:sz w:val="20"/>
+      </w:rPr>
+    </w:lvl>
+    <w:lvl w:ilvl="3" w:tentative="1">
+      <w:start w:val="1"/>
+      <w:numFmt w:val="bullet"/>
+      <w:lvlText w:val=""/>
+      <w:lvlJc w:val="left"/>
+      <w:pPr>
+        <w:tabs>
+          <w:tab w:val="num" w:pos="2880"/>
+        </w:tabs>
+        <w:ind w:left="2880" w:hanging="360"/>
+      </w:pPr>
+      <w:rPr>
+        <w:rFonts w:ascii="Wingdings" w:hAnsi="Wingdings" w:hint="default"/>
+        <w:sz w:val="20"/>
+      </w:rPr>
+    </w:lvl>
+    <w:lvl w:ilvl="4" w:tentative="1">
+      <w:start w:val="1"/>
+      <w:numFmt w:val="bullet"/>
+      <w:lvlText w:val=""/>
+      <w:lvlJc w:val="left"/>
+      <w:pPr>
+        <w:tabs>
+          <w:tab w:val="num" w:pos="3600"/>
+        </w:tabs>
+        <w:ind w:left="3600" w:hanging="360"/>
+      </w:pPr>
+      <w:rPr>
+        <w:rFonts w:ascii="Wingdings" w:hAnsi="Wingdings" w:hint="default"/>
+        <w:sz w:val="20"/>
+      </w:rPr>
+    </w:lvl>
+    <w:lvl w:ilvl="5" w:tentative="1">
+      <w:start w:val="1"/>
+      <w:numFmt w:val="bullet"/>
+      <w:lvlText w:val=""/>
+      <w:lvlJc w:val="left"/>
+      <w:pPr>
+        <w:tabs>
+          <w:tab w:val="num" w:pos="4320"/>
+        </w:tabs>
+        <w:ind w:left="4320" w:hanging="360"/>
+      </w:pPr>
+      <w:rPr>
+        <w:rFonts w:ascii="Wingdings" w:hAnsi="Wingdings" w:hint="default"/>
+        <w:sz w:val="20"/>
+      </w:rPr>
+    </w:lvl>
+    <w:lvl w:ilvl="6" w:tentative="1">
+      <w:start w:val="1"/>
+      <w:numFmt w:val="bullet"/>
+      <w:lvlText w:val=""/>
+      <w:lvlJc w:val="left"/>
+      <w:pPr>
+        <w:tabs>
+          <w:tab w:val="num" w:pos="5040"/>
+        </w:tabs>
+        <w:ind w:left="5040" w:hanging="360"/>
+      </w:pPr>
+      <w:rPr>
+        <w:rFonts w:ascii="Wingdings" w:hAnsi="Wingdings" w:hint="default"/>
+        <w:sz w:val="20"/>
+      </w:rPr>
+    </w:lvl>
+    <w:lvl w:ilvl="7" w:tentative="1">
+      <w:start w:val="1"/>
+      <w:numFmt w:val="bullet"/>
+      <w:lvlText w:val=""/>
+      <w:lvlJc w:val="left"/>
+      <w:pPr>
+        <w:tabs>
+          <w:tab w:val="num" w:pos="5760"/>
+        </w:tabs>
+        <w:ind w:left="5760" w:hanging="360"/>
+      </w:pPr>
+      <w:rPr>
+        <w:rFonts w:ascii="Wingdings" w:hAnsi="Wingdings" w:hint="default"/>
+        <w:sz w:val="20"/>
+      </w:rPr>
+    </w:lvl>
+    <w:lvl w:ilvl="8" w:tentative="1">
+      <w:start w:val="1"/>
+      <w:numFmt w:val="bullet"/>
+      <w:lvlText w:val=""/>
+      <w:lvlJc w:val="left"/>
+      <w:pPr>
+        <w:tabs>
+          <w:tab w:val="num" w:pos="6480"/>
+        </w:tabs>
+        <w:ind w:left="6480" w:hanging="360"/>
+      </w:pPr>
+      <w:rPr>
+        <w:rFonts w:ascii="Wingdings" w:hAnsi="Wingdings" w:hint="default"/>
+        <w:sz w:val="20"/>
+      </w:rPr>
+    </w:lvl>
+  </w:abstractNum>
+  <w:abstractNum w:abstractNumId="11" w15:restartNumberingAfterBreak="0">
     <w:nsid w:val="57A21B6F"/>
     <w:multiLevelType w:val="multilevel"/>
     <w:tmpl w:val="4D368458"/>
@@ -2354,7 +3919,156 @@
       </w:rPr>
     </w:lvl>
   </w:abstractNum>
-  <w:abstractNum w:abstractNumId="4" w15:restartNumberingAfterBreak="0">
+  <w:abstractNum w:abstractNumId="12" w15:restartNumberingAfterBreak="0">
+    <w:nsid w:val="61652E99"/>
+    <w:multiLevelType w:val="multilevel"/>
+    <w:tmpl w:val="CDF24FD8"/>
+    <w:lvl w:ilvl="0">
+      <w:start w:val="1"/>
+      <w:numFmt w:val="bullet"/>
+      <w:lvlText w:val=""/>
+      <w:lvlJc w:val="left"/>
+      <w:pPr>
+        <w:tabs>
+          <w:tab w:val="num" w:pos="720"/>
+        </w:tabs>
+        <w:ind w:left="720" w:hanging="360"/>
+      </w:pPr>
+      <w:rPr>
+        <w:rFonts w:ascii="Symbol" w:hAnsi="Symbol" w:hint="default"/>
+        <w:sz w:val="20"/>
+      </w:rPr>
+    </w:lvl>
+    <w:lvl w:ilvl="1" w:tentative="1">
+      <w:start w:val="1"/>
+      <w:numFmt w:val="bullet"/>
+      <w:lvlText w:val="o"/>
+      <w:lvlJc w:val="left"/>
+      <w:pPr>
+        <w:tabs>
+          <w:tab w:val="num" w:pos="1440"/>
+        </w:tabs>
+        <w:ind w:left="1440" w:hanging="360"/>
+      </w:pPr>
+      <w:rPr>
+        <w:rFonts w:ascii="Courier New" w:hAnsi="Courier New" w:hint="default"/>
+        <w:sz w:val="20"/>
+      </w:rPr>
+    </w:lvl>
+    <w:lvl w:ilvl="2" w:tentative="1">
+      <w:start w:val="1"/>
+      <w:numFmt w:val="bullet"/>
+      <w:lvlText w:val=""/>
+      <w:lvlJc w:val="left"/>
+      <w:pPr>
+        <w:tabs>
+          <w:tab w:val="num" w:pos="2160"/>
+        </w:tabs>
+        <w:ind w:left="2160" w:hanging="360"/>
+      </w:pPr>
+      <w:rPr>
+        <w:rFonts w:ascii="Wingdings" w:hAnsi="Wingdings" w:hint="default"/>
+        <w:sz w:val="20"/>
+      </w:rPr>
+    </w:lvl>
+    <w:lvl w:ilvl="3" w:tentative="1">
+      <w:start w:val="1"/>
+      <w:numFmt w:val="bullet"/>
+      <w:lvlText w:val=""/>
+      <w:lvlJc w:val="left"/>
+      <w:pPr>
+        <w:tabs>
+          <w:tab w:val="num" w:pos="2880"/>
+        </w:tabs>
+        <w:ind w:left="2880" w:hanging="360"/>
+      </w:pPr>
+      <w:rPr>
+        <w:rFonts w:ascii="Wingdings" w:hAnsi="Wingdings" w:hint="default"/>
+        <w:sz w:val="20"/>
+      </w:rPr>
+    </w:lvl>
+    <w:lvl w:ilvl="4" w:tentative="1">
+      <w:start w:val="1"/>
+      <w:numFmt w:val="bullet"/>
+      <w:lvlText w:val=""/>
+      <w:lvlJc w:val="left"/>
+      <w:pPr>
+        <w:tabs>
+          <w:tab w:val="num" w:pos="3600"/>
+        </w:tabs>
+        <w:ind w:left="3600" w:hanging="360"/>
+      </w:pPr>
+      <w:rPr>
+        <w:rFonts w:ascii="Wingdings" w:hAnsi="Wingdings" w:hint="default"/>
+        <w:sz w:val="20"/>
+      </w:rPr>
+    </w:lvl>
+    <w:lvl w:ilvl="5" w:tentative="1">
+      <w:start w:val="1"/>
+      <w:numFmt w:val="bullet"/>
+      <w:lvlText w:val=""/>
+      <w:lvlJc w:val="left"/>
+      <w:pPr>
+        <w:tabs>
+          <w:tab w:val="num" w:pos="4320"/>
+        </w:tabs>
+        <w:ind w:left="4320" w:hanging="360"/>
+      </w:pPr>
+      <w:rPr>
+        <w:rFonts w:ascii="Wingdings" w:hAnsi="Wingdings" w:hint="default"/>
+        <w:sz w:val="20"/>
+      </w:rPr>
+    </w:lvl>
+    <w:lvl w:ilvl="6" w:tentative="1">
+      <w:start w:val="1"/>
+      <w:numFmt w:val="bullet"/>
+      <w:lvlText w:val=""/>
+      <w:lvlJc w:val="left"/>
+      <w:pPr>
+        <w:tabs>
+          <w:tab w:val="num" w:pos="5040"/>
+        </w:tabs>
+        <w:ind w:left="5040" w:hanging="360"/>
+      </w:pPr>
+      <w:rPr>
+        <w:rFonts w:ascii="Wingdings" w:hAnsi="Wingdings" w:hint="default"/>
+        <w:sz w:val="20"/>
+      </w:rPr>
+    </w:lvl>
+    <w:lvl w:ilvl="7" w:tentative="1">
+      <w:start w:val="1"/>
+      <w:numFmt w:val="bullet"/>
+      <w:lvlText w:val=""/>
+      <w:lvlJc w:val="left"/>
+      <w:pPr>
+        <w:tabs>
+          <w:tab w:val="num" w:pos="5760"/>
+        </w:tabs>
+        <w:ind w:left="5760" w:hanging="360"/>
+      </w:pPr>
+      <w:rPr>
+        <w:rFonts w:ascii="Wingdings" w:hAnsi="Wingdings" w:hint="default"/>
+        <w:sz w:val="20"/>
+      </w:rPr>
+    </w:lvl>
+    <w:lvl w:ilvl="8" w:tentative="1">
+      <w:start w:val="1"/>
+      <w:numFmt w:val="bullet"/>
+      <w:lvlText w:val=""/>
+      <w:lvlJc w:val="left"/>
+      <w:pPr>
+        <w:tabs>
+          <w:tab w:val="num" w:pos="6480"/>
+        </w:tabs>
+        <w:ind w:left="6480" w:hanging="360"/>
+      </w:pPr>
+      <w:rPr>
+        <w:rFonts w:ascii="Wingdings" w:hAnsi="Wingdings" w:hint="default"/>
+        <w:sz w:val="20"/>
+      </w:rPr>
+    </w:lvl>
+  </w:abstractNum>
+  <w:abstractNum w:abstractNumId="13" w15:restartNumberingAfterBreak="0">
     <w:nsid w:val="6B932C0E"/>
     <w:multiLevelType w:val="multilevel"/>
     <w:tmpl w:val="B50C1044"/>
@@ -2503,20 +4217,503 @@
       </w:rPr>
     </w:lvl>
   </w:abstractNum>
+  <w:abstractNum w:abstractNumId="14" w15:restartNumberingAfterBreak="0">
+    <w:nsid w:val="76196576"/>
+    <w:multiLevelType w:val="multilevel"/>
+    <w:tmpl w:val="76F63EDA"/>
+    <w:lvl w:ilvl="0">
+      <w:start w:val="1"/>
+      <w:numFmt w:val="bullet"/>
+      <w:lvlText w:val=""/>
+      <w:lvlJc w:val="left"/>
+      <w:pPr>
+        <w:tabs>
+          <w:tab w:val="num" w:pos="720"/>
+        </w:tabs>
+        <w:ind w:left="720" w:hanging="360"/>
+      </w:pPr>
+      <w:rPr>
+        <w:rFonts w:ascii="Symbol" w:hAnsi="Symbol" w:hint="default"/>
+        <w:sz w:val="20"/>
+      </w:rPr>
+    </w:lvl>
+    <w:lvl w:ilvl="1" w:tentative="1">
+      <w:start w:val="1"/>
+      <w:numFmt w:val="bullet"/>
+      <w:lvlText w:val="o"/>
+      <w:lvlJc w:val="left"/>
+      <w:pPr>
+        <w:tabs>
+          <w:tab w:val="num" w:pos="1440"/>
+        </w:tabs>
+        <w:ind w:left="1440" w:hanging="360"/>
+      </w:pPr>
+      <w:rPr>
+        <w:rFonts w:ascii="Courier New" w:hAnsi="Courier New" w:hint="default"/>
+        <w:sz w:val="20"/>
+      </w:rPr>
+    </w:lvl>
+    <w:lvl w:ilvl="2" w:tentative="1">
+      <w:start w:val="1"/>
+      <w:numFmt w:val="bullet"/>
+      <w:lvlText w:val=""/>
+      <w:lvlJc w:val="left"/>
+      <w:pPr>
+        <w:tabs>
+          <w:tab w:val="num" w:pos="2160"/>
+        </w:tabs>
+        <w:ind w:left="2160" w:hanging="360"/>
+      </w:pPr>
+      <w:rPr>
+        <w:rFonts w:ascii="Wingdings" w:hAnsi="Wingdings" w:hint="default"/>
+        <w:sz w:val="20"/>
+      </w:rPr>
+    </w:lvl>
+    <w:lvl w:ilvl="3" w:tentative="1">
+      <w:start w:val="1"/>
+      <w:numFmt w:val="bullet"/>
+      <w:lvlText w:val=""/>
+      <w:lvlJc w:val="left"/>
+      <w:pPr>
+        <w:tabs>
+          <w:tab w:val="num" w:pos="2880"/>
+        </w:tabs>
+        <w:ind w:left="2880" w:hanging="360"/>
+      </w:pPr>
+      <w:rPr>
+        <w:rFonts w:ascii="Wingdings" w:hAnsi="Wingdings" w:hint="default"/>
+        <w:sz w:val="20"/>
+      </w:rPr>
+    </w:lvl>
+    <w:lvl w:ilvl="4" w:tentative="1">
+      <w:start w:val="1"/>
+      <w:numFmt w:val="bullet"/>
+      <w:lvlText w:val=""/>
+      <w:lvlJc w:val="left"/>
+      <w:pPr>
+        <w:tabs>
+          <w:tab w:val="num" w:pos="3600"/>
+        </w:tabs>
+        <w:ind w:left="3600" w:hanging="360"/>
+      </w:pPr>
+      <w:rPr>
+        <w:rFonts w:ascii="Wingdings" w:hAnsi="Wingdings" w:hint="default"/>
+        <w:sz w:val="20"/>
+      </w:rPr>
+    </w:lvl>
+    <w:lvl w:ilvl="5" w:tentative="1">
+      <w:start w:val="1"/>
+      <w:numFmt w:val="bullet"/>
+      <w:lvlText w:val=""/>
+      <w:lvlJc w:val="left"/>
+      <w:pPr>
+        <w:tabs>
+          <w:tab w:val="num" w:pos="4320"/>
+        </w:tabs>
+        <w:ind w:left="4320" w:hanging="360"/>
+      </w:pPr>
+      <w:rPr>
+        <w:rFonts w:ascii="Wingdings" w:hAnsi="Wingdings" w:hint="default"/>
+        <w:sz w:val="20"/>
+      </w:rPr>
+    </w:lvl>
+    <w:lvl w:ilvl="6" w:tentative="1">
+      <w:start w:val="1"/>
+      <w:numFmt w:val="bullet"/>
+      <w:lvlText w:val=""/>
+      <w:lvlJc w:val="left"/>
+      <w:pPr>
+        <w:tabs>
+          <w:tab w:val="num" w:pos="5040"/>
+        </w:tabs>
+        <w:ind w:left="5040" w:hanging="360"/>
+      </w:pPr>
+      <w:rPr>
+        <w:rFonts w:ascii="Wingdings" w:hAnsi="Wingdings" w:hint="default"/>
+        <w:sz w:val="20"/>
+      </w:rPr>
+    </w:lvl>
+    <w:lvl w:ilvl="7" w:tentative="1">
+      <w:start w:val="1"/>
+      <w:numFmt w:val="bullet"/>
+      <w:lvlText w:val=""/>
+      <w:lvlJc w:val="left"/>
+      <w:pPr>
+        <w:tabs>
+          <w:tab w:val="num" w:pos="5760"/>
+        </w:tabs>
+        <w:ind w:left="5760" w:hanging="360"/>
+      </w:pPr>
+      <w:rPr>
+        <w:rFonts w:ascii="Wingdings" w:hAnsi="Wingdings" w:hint="default"/>
+        <w:sz w:val="20"/>
+      </w:rPr>
+    </w:lvl>
+    <w:lvl w:ilvl="8" w:tentative="1">
+      <w:start w:val="1"/>
+      <w:numFmt w:val="bullet"/>
+      <w:lvlText w:val=""/>
+      <w:lvlJc w:val="left"/>
+      <w:pPr>
+        <w:tabs>
+          <w:tab w:val="num" w:pos="6480"/>
+        </w:tabs>
+        <w:ind w:left="6480" w:hanging="360"/>
+      </w:pPr>
+      <w:rPr>
+        <w:rFonts w:ascii="Wingdings" w:hAnsi="Wingdings" w:hint="default"/>
+        <w:sz w:val="20"/>
+      </w:rPr>
+    </w:lvl>
+  </w:abstractNum>
+  <w:abstractNum w:abstractNumId="15" w15:restartNumberingAfterBreak="0">
+    <w:nsid w:val="7A52777A"/>
+    <w:multiLevelType w:val="multilevel"/>
+    <w:tmpl w:val="C16242BE"/>
+    <w:lvl w:ilvl="0">
+      <w:start w:val="1"/>
+      <w:numFmt w:val="bullet"/>
+      <w:lvlText w:val=""/>
+      <w:lvlJc w:val="left"/>
+      <w:pPr>
+        <w:tabs>
+          <w:tab w:val="num" w:pos="720"/>
+        </w:tabs>
+        <w:ind w:left="720" w:hanging="360"/>
+      </w:pPr>
+      <w:rPr>
+        <w:rFonts w:ascii="Symbol" w:hAnsi="Symbol" w:hint="default"/>
+        <w:sz w:val="20"/>
+      </w:rPr>
+    </w:lvl>
+    <w:lvl w:ilvl="1" w:tentative="1">
+      <w:start w:val="1"/>
+      <w:numFmt w:val="bullet"/>
+      <w:lvlText w:val="o"/>
+      <w:lvlJc w:val="left"/>
+      <w:pPr>
+        <w:tabs>
+          <w:tab w:val="num" w:pos="1440"/>
+        </w:tabs>
+        <w:ind w:left="1440" w:hanging="360"/>
+      </w:pPr>
+      <w:rPr>
+        <w:rFonts w:ascii="Courier New" w:hAnsi="Courier New" w:hint="default"/>
+        <w:sz w:val="20"/>
+      </w:rPr>
+    </w:lvl>
+    <w:lvl w:ilvl="2" w:tentative="1">
+      <w:start w:val="1"/>
+      <w:numFmt w:val="bullet"/>
+      <w:lvlText w:val=""/>
+      <w:lvlJc w:val="left"/>
+      <w:pPr>
+        <w:tabs>
+          <w:tab w:val="num" w:pos="2160"/>
+        </w:tabs>
+        <w:ind w:left="2160" w:hanging="360"/>
+      </w:pPr>
+      <w:rPr>
+        <w:rFonts w:ascii="Wingdings" w:hAnsi="Wingdings" w:hint="default"/>
+        <w:sz w:val="20"/>
+      </w:rPr>
+    </w:lvl>
+    <w:lvl w:ilvl="3" w:tentative="1">
+      <w:start w:val="1"/>
+      <w:numFmt w:val="bullet"/>
+      <w:lvlText w:val=""/>
+      <w:lvlJc w:val="left"/>
+      <w:pPr>
+        <w:tabs>
+          <w:tab w:val="num" w:pos="2880"/>
+        </w:tabs>
+        <w:ind w:left="2880" w:hanging="360"/>
+      </w:pPr>
+      <w:rPr>
+        <w:rFonts w:ascii="Wingdings" w:hAnsi="Wingdings" w:hint="default"/>
+        <w:sz w:val="20"/>
+      </w:rPr>
+    </w:lvl>
+    <w:lvl w:ilvl="4" w:tentative="1">
+      <w:start w:val="1"/>
+      <w:numFmt w:val="bullet"/>
+      <w:lvlText w:val=""/>
+      <w:lvlJc w:val="left"/>
+      <w:pPr>
+        <w:tabs>
+          <w:tab w:val="num" w:pos="3600"/>
+        </w:tabs>
+        <w:ind w:left="3600" w:hanging="360"/>
+      </w:pPr>
+      <w:rPr>
+        <w:rFonts w:ascii="Wingdings" w:hAnsi="Wingdings" w:hint="default"/>
+        <w:sz w:val="20"/>
+      </w:rPr>
+    </w:lvl>
+    <w:lvl w:ilvl="5" w:tentative="1">
+      <w:start w:val="1"/>
+      <w:numFmt w:val="bullet"/>
+      <w:lvlText w:val=""/>
+      <w:lvlJc w:val="left"/>
+      <w:pPr>
+        <w:tabs>
+          <w:tab w:val="num" w:pos="4320"/>
+        </w:tabs>
+        <w:ind w:left="4320" w:hanging="360"/>
+      </w:pPr>
+      <w:rPr>
+        <w:rFonts w:ascii="Wingdings" w:hAnsi="Wingdings" w:hint="default"/>
+        <w:sz w:val="20"/>
+      </w:rPr>
+    </w:lvl>
+    <w:lvl w:ilvl="6" w:tentative="1">
+      <w:start w:val="1"/>
+      <w:numFmt w:val="bullet"/>
+      <w:lvlText w:val=""/>
+      <w:lvlJc w:val="left"/>
+      <w:pPr>
+        <w:tabs>
+          <w:tab w:val="num" w:pos="5040"/>
+        </w:tabs>
+        <w:ind w:left="5040" w:hanging="360"/>
+      </w:pPr>
+      <w:rPr>
+        <w:rFonts w:ascii="Wingdings" w:hAnsi="Wingdings" w:hint="default"/>
+        <w:sz w:val="20"/>
+      </w:rPr>
+    </w:lvl>
+    <w:lvl w:ilvl="7" w:tentative="1">
+      <w:start w:val="1"/>
+      <w:numFmt w:val="bullet"/>
+      <w:lvlText w:val=""/>
+      <w:lvlJc w:val="left"/>
+      <w:pPr>
+        <w:tabs>
+          <w:tab w:val="num" w:pos="5760"/>
+        </w:tabs>
+        <w:ind w:left="5760" w:hanging="360"/>
+      </w:pPr>
+      <w:rPr>
+        <w:rFonts w:ascii="Wingdings" w:hAnsi="Wingdings" w:hint="default"/>
+        <w:sz w:val="20"/>
+      </w:rPr>
+    </w:lvl>
+    <w:lvl w:ilvl="8" w:tentative="1">
+      <w:start w:val="1"/>
+      <w:numFmt w:val="bullet"/>
+      <w:lvlText w:val=""/>
+      <w:lvlJc w:val="left"/>
+      <w:pPr>
+        <w:tabs>
+          <w:tab w:val="num" w:pos="6480"/>
+        </w:tabs>
+        <w:ind w:left="6480" w:hanging="360"/>
+      </w:pPr>
+      <w:rPr>
+        <w:rFonts w:ascii="Wingdings" w:hAnsi="Wingdings" w:hint="default"/>
+        <w:sz w:val="20"/>
+      </w:rPr>
+    </w:lvl>
+  </w:abstractNum>
+  <w:abstractNum w:abstractNumId="16" w15:restartNumberingAfterBreak="0">
+    <w:nsid w:val="7F4976D2"/>
+    <w:multiLevelType w:val="multilevel"/>
+    <w:tmpl w:val="6D12A746"/>
+    <w:lvl w:ilvl="0">
+      <w:start w:val="1"/>
+      <w:numFmt w:val="bullet"/>
+      <w:lvlText w:val=""/>
+      <w:lvlJc w:val="left"/>
+      <w:pPr>
+        <w:tabs>
+          <w:tab w:val="num" w:pos="720"/>
+        </w:tabs>
+        <w:ind w:left="720" w:hanging="360"/>
+      </w:pPr>
+      <w:rPr>
+        <w:rFonts w:ascii="Symbol" w:hAnsi="Symbol" w:hint="default"/>
+        <w:sz w:val="20"/>
+      </w:rPr>
+    </w:lvl>
+    <w:lvl w:ilvl="1" w:tentative="1">
+      <w:start w:val="1"/>
+      <w:numFmt w:val="bullet"/>
+      <w:lvlText w:val="o"/>
+      <w:lvlJc w:val="left"/>
+      <w:pPr>
+        <w:tabs>
+          <w:tab w:val="num" w:pos="1440"/>
+        </w:tabs>
+        <w:ind w:left="1440" w:hanging="360"/>
+      </w:pPr>
+      <w:rPr>
+        <w:rFonts w:ascii="Courier New" w:hAnsi="Courier New" w:hint="default"/>
+        <w:sz w:val="20"/>
+      </w:rPr>
+    </w:lvl>
+    <w:lvl w:ilvl="2" w:tentative="1">
+      <w:start w:val="1"/>
+      <w:numFmt w:val="bullet"/>
+      <w:lvlText w:val=""/>
+      <w:lvlJc w:val="left"/>
+      <w:pPr>
+        <w:tabs>
+          <w:tab w:val="num" w:pos="2160"/>
+        </w:tabs>
+        <w:ind w:left="2160" w:hanging="360"/>
+      </w:pPr>
+      <w:rPr>
+        <w:rFonts w:ascii="Wingdings" w:hAnsi="Wingdings" w:hint="default"/>
+        <w:sz w:val="20"/>
+      </w:rPr>
+    </w:lvl>
+    <w:lvl w:ilvl="3" w:tentative="1">
+      <w:start w:val="1"/>
+      <w:numFmt w:val="bullet"/>
+      <w:lvlText w:val=""/>
+      <w:lvlJc w:val="left"/>
+      <w:pPr>
+        <w:tabs>
+          <w:tab w:val="num" w:pos="2880"/>
+        </w:tabs>
+        <w:ind w:left="2880" w:hanging="360"/>
+      </w:pPr>
+      <w:rPr>
+        <w:rFonts w:ascii="Wingdings" w:hAnsi="Wingdings" w:hint="default"/>
+        <w:sz w:val="20"/>
+      </w:rPr>
+    </w:lvl>
+    <w:lvl w:ilvl="4" w:tentative="1">
+      <w:start w:val="1"/>
+      <w:numFmt w:val="bullet"/>
+      <w:lvlText w:val=""/>
+      <w:lvlJc w:val="left"/>
+      <w:pPr>
+        <w:tabs>
+          <w:tab w:val="num" w:pos="3600"/>
+        </w:tabs>
+        <w:ind w:left="3600" w:hanging="360"/>
+      </w:pPr>
+      <w:rPr>
+        <w:rFonts w:ascii="Wingdings" w:hAnsi="Wingdings" w:hint="default"/>
+        <w:sz w:val="20"/>
+      </w:rPr>
+    </w:lvl>
+    <w:lvl w:ilvl="5" w:tentative="1">
+      <w:start w:val="1"/>
+      <w:numFmt w:val="bullet"/>
+      <w:lvlText w:val=""/>
+      <w:lvlJc w:val="left"/>
+      <w:pPr>
+        <w:tabs>
+          <w:tab w:val="num" w:pos="4320"/>
+        </w:tabs>
+        <w:ind w:left="4320" w:hanging="360"/>
+      </w:pPr>
+      <w:rPr>
+        <w:rFonts w:ascii="Wingdings" w:hAnsi="Wingdings" w:hint="default"/>
+        <w:sz w:val="20"/>
+      </w:rPr>
+    </w:lvl>
+    <w:lvl w:ilvl="6" w:tentative="1">
+      <w:start w:val="1"/>
+      <w:numFmt w:val="bullet"/>
+      <w:lvlText w:val=""/>
+      <w:lvlJc w:val="left"/>
+      <w:pPr>
+        <w:tabs>
+          <w:tab w:val="num" w:pos="5040"/>
+        </w:tabs>
+        <w:ind w:left="5040" w:hanging="360"/>
+      </w:pPr>
+      <w:rPr>
+        <w:rFonts w:ascii="Wingdings" w:hAnsi="Wingdings" w:hint="default"/>
+        <w:sz w:val="20"/>
+      </w:rPr>
+    </w:lvl>
+    <w:lvl w:ilvl="7" w:tentative="1">
+      <w:start w:val="1"/>
+      <w:numFmt w:val="bullet"/>
+      <w:lvlText w:val=""/>
+      <w:lvlJc w:val="left"/>
+      <w:pPr>
+        <w:tabs>
+          <w:tab w:val="num" w:pos="5760"/>
+        </w:tabs>
+        <w:ind w:left="5760" w:hanging="360"/>
+      </w:pPr>
+      <w:rPr>
+        <w:rFonts w:ascii="Wingdings" w:hAnsi="Wingdings" w:hint="default"/>
+        <w:sz w:val="20"/>
+      </w:rPr>
+    </w:lvl>
+    <w:lvl w:ilvl="8" w:tentative="1">
+      <w:start w:val="1"/>
+      <w:numFmt w:val="bullet"/>
+      <w:lvlText w:val=""/>
+      <w:lvlJc w:val="left"/>
+      <w:pPr>
+        <w:tabs>
+          <w:tab w:val="num" w:pos="6480"/>
+        </w:tabs>
+        <w:ind w:left="6480" w:hanging="360"/>
+      </w:pPr>
+      <w:rPr>
+        <w:rFonts w:ascii="Wingdings" w:hAnsi="Wingdings" w:hint="default"/>
+        <w:sz w:val="20"/>
+      </w:rPr>
+    </w:lvl>
+  </w:abstractNum>
   <w:num w:numId="1" w16cid:durableId="354424047">
+    <w:abstractNumId w:val="2"/>
+  </w:num>
+  <w:num w:numId="2" w16cid:durableId="1105029749">
+    <w:abstractNumId w:val="11"/>
+  </w:num>
+  <w:num w:numId="3" w16cid:durableId="852256633">
+    <w:abstractNumId w:val="13"/>
+  </w:num>
+  <w:num w:numId="4" w16cid:durableId="1114909887">
+    <w:abstractNumId w:val="8"/>
+  </w:num>
+  <w:num w:numId="5" w16cid:durableId="1933391980">
+    <w:abstractNumId w:val="9"/>
+  </w:num>
+  <w:num w:numId="6" w16cid:durableId="1112626129">
+    <w:abstractNumId w:val="12"/>
+  </w:num>
+  <w:num w:numId="7" w16cid:durableId="824660000">
+    <w:abstractNumId w:val="6"/>
+  </w:num>
+  <w:num w:numId="8" w16cid:durableId="796607970">
+    <w:abstractNumId w:val="1"/>
+  </w:num>
+  <w:num w:numId="9" w16cid:durableId="538972465">
+    <w:abstractNumId w:val="3"/>
+  </w:num>
+  <w:num w:numId="10" w16cid:durableId="1535191602">
+    <w:abstractNumId w:val="4"/>
+  </w:num>
+  <w:num w:numId="11" w16cid:durableId="2045516736">
+    <w:abstractNumId w:val="15"/>
+  </w:num>
+  <w:num w:numId="12" w16cid:durableId="1743872076">
+    <w:abstractNumId w:val="10"/>
+  </w:num>
+  <w:num w:numId="13" w16cid:durableId="1459450103">
     <w:abstractNumId w:val="0"/>
   </w:num>
-  <w:num w:numId="2" w16cid:durableId="1105029749">
-    <w:abstractNumId w:val="3"/>
+  <w:num w:numId="14" w16cid:durableId="1427187362">
+    <w:abstractNumId w:val="16"/>
   </w:num>
-  <w:num w:numId="3" w16cid:durableId="852256633">
-    <w:abstractNumId w:val="4"/>
+  <w:num w:numId="15" w16cid:durableId="1354382883">
+    <w:abstractNumId w:val="5"/>
   </w:num>
-  <w:num w:numId="4" w16cid:durableId="1114909887">
-    <w:abstractNumId w:val="1"/>
+  <w:num w:numId="16" w16cid:durableId="1427340114">
+    <w:abstractNumId w:val="14"/>
   </w:num>
-  <w:num w:numId="5" w16cid:durableId="1933391980">
-    <w:abstractNumId w:val="2"/>
+  <w:num w:numId="17" w16cid:durableId="1171528194">
+    <w:abstractNumId w:val="7"/>
   </w:num>
 </w:numbering>
 </file>
@@ -3124,7 +5321,6 @@
   <w:style w:type="character" w:default="1" w:styleId="DefaultParagraphFont">
     <w:name w:val="Default Paragraph Font"/>
     <w:uiPriority w:val="1"/>
-    <w:semiHidden/>
     <w:unhideWhenUsed/>
   </w:style>
   <w:style w:type="table" w:default="1" w:styleId="TableNormal">

</xml_diff>